<commit_message>
final touches of Assingment1
</commit_message>
<xml_diff>
--- a/UML/Insurance_Full_Test_Case.docx
+++ b/UML/Insurance_Full_Test_Case.docx
@@ -2978,13 +2978,31 @@
         <w:rPr>
           <w:rFonts w:asciiTheme="majorBidi" w:hAnsiTheme="majorBidi" w:cstheme="majorBidi"/>
         </w:rPr>
-        <w:t>Payment = 25000 / (100 + 1×200 + 20) = 25000 / 320 = 78.125</w:t>
+        <w:t>Payment = 25000 / 100 + 1×200 + 20</w:t>
+      </w:r>
+      <w:r>
+        <w:rPr>
+          <w:rFonts w:asciiTheme="majorBidi" w:hAnsiTheme="majorBidi" w:cstheme="majorBidi"/>
+        </w:rPr>
+        <w:t xml:space="preserve"> </w:t>
+      </w:r>
+      <w:r>
+        <w:rPr>
+          <w:rFonts w:asciiTheme="majorBidi" w:hAnsiTheme="majorBidi" w:cstheme="majorBidi"/>
+        </w:rPr>
+        <w:t xml:space="preserve">= </w:t>
+      </w:r>
+      <w:r>
+        <w:rPr>
+          <w:rFonts w:asciiTheme="majorBidi" w:hAnsiTheme="majorBidi" w:cstheme="majorBidi"/>
+        </w:rPr>
+        <w:t>470.0</w:t>
       </w:r>
     </w:p>
     <w:p>
       <w:pPr>
         <w:rPr>
-          <w:rFonts w:asciiTheme="majorBidi" w:hAnsiTheme="majorBidi" w:cstheme="majorBidi"/>
+          <w:rFonts w:asciiTheme="majorBidi" w:hAnsiTheme="majorBidi"/>
         </w:rPr>
       </w:pPr>
       <w:r>
@@ -2992,7 +3010,16 @@
           <w:rFonts w:asciiTheme="majorBidi" w:hAnsiTheme="majorBidi" w:cstheme="majorBidi"/>
           <w:b/>
         </w:rPr>
-        <w:t>Expected payment: $78.125</w:t>
+        <w:t xml:space="preserve">Expected payment: </w:t>
+      </w:r>
+      <w:r>
+        <w:t>$470.00</w:t>
+      </w:r>
+      <w:r>
+        <w:rPr>
+          <w:rFonts w:asciiTheme="majorBidi" w:hAnsiTheme="majorBidi"/>
+        </w:rPr>
+        <w:t xml:space="preserve"> </w:t>
       </w:r>
     </w:p>
     <w:p>
@@ -3007,7 +3034,7 @@
           <w:rFonts w:asciiTheme="majorBidi" w:hAnsiTheme="majorBidi"/>
         </w:rPr>
         <w:lastRenderedPageBreak/>
-        <w:t>Policy 102 — Comprehensive, age 35</w:t>
+        <w:t>Policy 102 — Comprehensive, age 28</w:t>
       </w:r>
     </w:p>
     <w:p>
@@ -3020,7 +3047,33 @@
         <w:rPr>
           <w:rFonts w:asciiTheme="majorBidi" w:hAnsiTheme="majorBidi" w:cstheme="majorBidi"/>
         </w:rPr>
-        <w:t>Payment = 52000 / (50 + 0×200 + 20) = 52000 / 70 = 742.857142857</w:t>
+        <w:t xml:space="preserve">Base = </w:t>
+      </w:r>
+      <w:proofErr w:type="gramStart"/>
+      <w:r>
+        <w:rPr>
+          <w:rFonts w:asciiTheme="majorBidi" w:hAnsiTheme="majorBidi" w:cstheme="majorBidi"/>
+        </w:rPr>
+        <w:t xml:space="preserve">1060.0 </w:t>
+      </w:r>
+      <w:r>
+        <w:rPr>
+          <w:rFonts w:asciiTheme="majorBidi" w:hAnsiTheme="majorBidi" w:cstheme="majorBidi"/>
+        </w:rPr>
+        <w:t>;</w:t>
+      </w:r>
+      <w:proofErr w:type="gramEnd"/>
+      <w:r>
+        <w:rPr>
+          <w:rFonts w:asciiTheme="majorBidi" w:hAnsiTheme="majorBidi" w:cstheme="majorBidi"/>
+        </w:rPr>
+        <w:t xml:space="preserve"> surcharge = (30−28)×50 = 100; total = </w:t>
+      </w:r>
+      <w:r>
+        <w:rPr>
+          <w:rFonts w:asciiTheme="majorBidi" w:hAnsiTheme="majorBidi" w:cstheme="majorBidi"/>
+        </w:rPr>
+        <w:t>1160.0</w:t>
       </w:r>
     </w:p>
     <w:p>
@@ -3034,185 +3087,42 @@
           <w:rFonts w:asciiTheme="majorBidi" w:hAnsiTheme="majorBidi" w:cstheme="majorBidi"/>
           <w:b/>
         </w:rPr>
-        <w:t>Expected payment: $742.857</w:t>
+        <w:t xml:space="preserve">Expected payment: </w:t>
+      </w:r>
+      <w:r>
+        <w:rPr>
+          <w:rFonts w:asciiTheme="majorBidi" w:hAnsiTheme="majorBidi" w:cstheme="majorBidi"/>
+          <w:b/>
+        </w:rPr>
+        <w:t>1160.0</w:t>
       </w:r>
     </w:p>
     <w:p>
       <w:pPr>
-        <w:pStyle w:val="Heading2"/>
-        <w:rPr>
-          <w:rFonts w:asciiTheme="majorBidi" w:hAnsiTheme="majorBidi"/>
-        </w:rPr>
+        <w:pStyle w:val="NormalWeb"/>
       </w:pPr>
       <w:r>
-        <w:rPr>
-          <w:rFonts w:asciiTheme="majorBidi" w:hAnsiTheme="majorBidi"/>
-        </w:rPr>
-        <w:t>Policy 102 — Comprehensive, age 28</w:t>
-      </w:r>
-    </w:p>
-    <w:p>
-      <w:pPr>
-        <w:rPr>
-          <w:rFonts w:asciiTheme="majorBidi" w:hAnsiTheme="majorBidi" w:cstheme="majorBidi"/>
-        </w:rPr>
-      </w:pPr>
-      <w:r>
-        <w:rPr>
-          <w:rFonts w:asciiTheme="majorBidi" w:hAnsiTheme="majorBidi" w:cstheme="majorBidi"/>
-        </w:rPr>
-        <w:t>Base = 52000 / 70 = 742.857142857; surcharge = (30−</w:t>
-      </w:r>
-      <w:proofErr w:type="gramStart"/>
-      <w:r>
-        <w:rPr>
-          <w:rFonts w:asciiTheme="majorBidi" w:hAnsiTheme="majorBidi" w:cstheme="majorBidi"/>
-        </w:rPr>
-        <w:t>28)×</w:t>
-      </w:r>
-      <w:proofErr w:type="gramEnd"/>
-      <w:r>
-        <w:rPr>
-          <w:rFonts w:asciiTheme="majorBidi" w:hAnsiTheme="majorBidi" w:cstheme="majorBidi"/>
-        </w:rPr>
-        <w:t>50 = 100; total = 842.857142857</w:t>
-      </w:r>
-    </w:p>
-    <w:p>
-      <w:pPr>
-        <w:rPr>
-          <w:rFonts w:asciiTheme="majorBidi" w:hAnsiTheme="majorBidi" w:cstheme="majorBidi"/>
-        </w:rPr>
-      </w:pPr>
-      <w:r>
-        <w:rPr>
-          <w:rFonts w:asciiTheme="majorBidi" w:hAnsiTheme="majorBidi" w:cstheme="majorBidi"/>
-          <w:b/>
-        </w:rPr>
-        <w:t>Expected payment: $842.857</w:t>
-      </w:r>
-    </w:p>
-    <w:p>
-      <w:pPr>
-        <w:pStyle w:val="Heading2"/>
-        <w:rPr>
-          <w:rFonts w:asciiTheme="majorBidi" w:hAnsiTheme="majorBidi"/>
-        </w:rPr>
-      </w:pPr>
-      <w:r>
-        <w:rPr>
-          <w:rFonts w:asciiTheme="majorBidi" w:hAnsiTheme="majorBidi"/>
-        </w:rPr>
-        <w:t>Policy 201 — Third Party</w:t>
-      </w:r>
-    </w:p>
-    <w:p>
-      <w:pPr>
-        <w:rPr>
-          <w:rFonts w:asciiTheme="majorBidi" w:hAnsiTheme="majorBidi" w:cstheme="majorBidi"/>
-        </w:rPr>
-      </w:pPr>
-      <w:r>
-        <w:rPr>
-          <w:rFonts w:asciiTheme="majorBidi" w:hAnsiTheme="majorBidi" w:cstheme="majorBidi"/>
-        </w:rPr>
-        <w:t>Payment = 18000 / (100 + 2×200 + 20) = 18000 / 520 = 34.615384615</w:t>
-      </w:r>
-    </w:p>
-    <w:p>
-      <w:pPr>
-        <w:rPr>
-          <w:rFonts w:asciiTheme="majorBidi" w:hAnsiTheme="majorBidi" w:cstheme="majorBidi"/>
-        </w:rPr>
-      </w:pPr>
-      <w:r>
-        <w:rPr>
-          <w:rFonts w:asciiTheme="majorBidi" w:hAnsiTheme="majorBidi" w:cstheme="majorBidi"/>
-          <w:b/>
-        </w:rPr>
-        <w:t>Expected payment: $34.615</w:t>
-      </w:r>
-    </w:p>
-    <w:p>
-      <w:pPr>
-        <w:pStyle w:val="Heading2"/>
-        <w:rPr>
-          <w:rFonts w:asciiTheme="majorBidi" w:hAnsiTheme="majorBidi"/>
-        </w:rPr>
-      </w:pPr>
-      <w:r>
-        <w:rPr>
-          <w:rFonts w:asciiTheme="majorBidi" w:hAnsiTheme="majorBidi"/>
-        </w:rPr>
-        <w:t>Policy 301 — Comprehensive</w:t>
-      </w:r>
-    </w:p>
-    <w:p>
-      <w:pPr>
-        <w:rPr>
-          <w:rFonts w:asciiTheme="majorBidi" w:hAnsiTheme="majorBidi" w:cstheme="majorBidi"/>
-        </w:rPr>
-      </w:pPr>
-      <w:r>
-        <w:rPr>
-          <w:rFonts w:asciiTheme="majorBidi" w:hAnsiTheme="majorBidi" w:cstheme="majorBidi"/>
-        </w:rPr>
-        <w:t>Payment = 45000 / (50 + 0×200 + 20) = 45000 / 70 = 642.857142857</w:t>
-      </w:r>
-    </w:p>
-    <w:p>
-      <w:pPr>
-        <w:rPr>
-          <w:rFonts w:asciiTheme="majorBidi" w:hAnsiTheme="majorBidi" w:cstheme="majorBidi"/>
-        </w:rPr>
-      </w:pPr>
-      <w:r>
-        <w:rPr>
-          <w:rFonts w:asciiTheme="majorBidi" w:hAnsiTheme="majorBidi" w:cstheme="majorBidi"/>
-          <w:b/>
-        </w:rPr>
-        <w:t>Expected payment: $642.857</w:t>
-      </w:r>
-    </w:p>
-    <w:p>
-      <w:pPr>
-        <w:pStyle w:val="Heading2"/>
-        <w:rPr>
-          <w:rFonts w:asciiTheme="majorBidi" w:hAnsiTheme="majorBidi"/>
-        </w:rPr>
-      </w:pPr>
-      <w:r>
-        <w:rPr>
-          <w:rFonts w:asciiTheme="majorBidi" w:hAnsiTheme="majorBidi"/>
-        </w:rPr>
-        <w:t>Policy 401 — Third Party</w:t>
-      </w:r>
-    </w:p>
-    <w:p>
-      <w:pPr>
-        <w:rPr>
-          <w:rFonts w:asciiTheme="majorBidi" w:hAnsiTheme="majorBidi" w:cstheme="majorBidi"/>
-        </w:rPr>
-      </w:pPr>
-      <w:r>
-        <w:rPr>
-          <w:rFonts w:asciiTheme="majorBidi" w:hAnsiTheme="majorBidi" w:cstheme="majorBidi"/>
-        </w:rPr>
-        <w:t>Payment = 30000 / (100 + 1×200 + 20) = 30000 / 320 = 93.75</w:t>
-      </w:r>
-    </w:p>
-    <w:p>
-      <w:pPr>
-        <w:rPr>
-          <w:rFonts w:asciiTheme="majorBidi" w:hAnsiTheme="majorBidi" w:cstheme="majorBidi"/>
-        </w:rPr>
-      </w:pPr>
-      <w:r>
-        <w:rPr>
-          <w:rFonts w:asciiTheme="majorBidi" w:hAnsiTheme="majorBidi" w:cstheme="majorBidi"/>
-          <w:b/>
-        </w:rPr>
-        <w:t>Expected payment: $93.750</w:t>
+        <w:t xml:space="preserve">Policy 1 (Alice): 470.0 </w:t>
+      </w:r>
+      <w:r>
+        <w:br/>
+        <w:t xml:space="preserve"> Policy 2 (Alice): 1160.0 </w:t>
+      </w:r>
+      <w:r>
+        <w:br/>
+        <w:t xml:space="preserve">Policy 3 (Bob): 18000/100 + 2*200 + 20 = 600.0 </w:t>
+      </w:r>
+      <w:r>
+        <w:br/>
+        <w:t xml:space="preserve">Policy 4 (Charlie): 45000/50 + 0*200 + 20 = 920.0 </w:t>
+      </w:r>
+      <w:r>
+        <w:br/>
+        <w:t xml:space="preserve">Policy 5 (Diana): 30000/100 + 1*200 + 20 = 520.0 </w:t>
+      </w:r>
+      <w:r>
+        <w:br/>
+        <w:t xml:space="preserve"> Expected: 470 + 1160 + 600 + 920 + 520 = 3670.0</w:t>
       </w:r>
     </w:p>
     <w:p>
@@ -3226,87 +3136,23 @@
         <w:rPr>
           <w:rFonts w:asciiTheme="majorBidi" w:hAnsiTheme="majorBidi"/>
         </w:rPr>
-        <w:t>Total Payment Calculations</w:t>
+        <w:t>5. Car Price Rise — Alice, 10%</w:t>
       </w:r>
     </w:p>
     <w:p>
       <w:pPr>
-        <w:pStyle w:val="Heading2"/>
-        <w:rPr>
-          <w:rFonts w:asciiTheme="majorBidi" w:hAnsiTheme="majorBidi"/>
-        </w:rPr>
+        <w:pStyle w:val="NormalWeb"/>
       </w:pPr>
       <w:r>
-        <w:rPr>
-          <w:rFonts w:asciiTheme="majorBidi" w:hAnsiTheme="majorBidi"/>
-        </w:rPr>
-        <w:t>Alice — User 1001</w:t>
-      </w:r>
-    </w:p>
-    <w:p>
-      <w:pPr>
-        <w:rPr>
-          <w:rFonts w:asciiTheme="majorBidi" w:hAnsiTheme="majorBidi" w:cstheme="majorBidi"/>
-        </w:rPr>
-      </w:pPr>
-      <w:r>
-        <w:rPr>
-          <w:rFonts w:asciiTheme="majorBidi" w:hAnsiTheme="majorBidi" w:cstheme="majorBidi"/>
-        </w:rPr>
-        <w:t>Policy 101 + Policy 102 = 78.125 + 842.857142857 = 920.982142857.</w:t>
-      </w:r>
-    </w:p>
-    <w:p>
-      <w:pPr>
-        <w:rPr>
-          <w:rFonts w:asciiTheme="majorBidi" w:hAnsiTheme="majorBidi" w:cstheme="majorBidi"/>
-        </w:rPr>
-      </w:pPr>
-      <w:r>
-        <w:rPr>
-          <w:rFonts w:asciiTheme="majorBidi" w:hAnsiTheme="majorBidi" w:cstheme="majorBidi"/>
-        </w:rPr>
-        <w:t>Expected Alice total: $920.982</w:t>
-      </w:r>
-    </w:p>
-    <w:p>
-      <w:pPr>
-        <w:pStyle w:val="Heading2"/>
-        <w:rPr>
-          <w:rFonts w:asciiTheme="majorBidi" w:hAnsiTheme="majorBidi"/>
-        </w:rPr>
-      </w:pPr>
-      <w:r>
-        <w:rPr>
-          <w:rFonts w:asciiTheme="majorBidi" w:hAnsiTheme="majorBidi"/>
-        </w:rPr>
-        <w:t>All Five Policies</w:t>
-      </w:r>
-    </w:p>
-    <w:p>
-      <w:pPr>
-        <w:rPr>
-          <w:rFonts w:asciiTheme="majorBidi" w:hAnsiTheme="majorBidi" w:cstheme="majorBidi"/>
-        </w:rPr>
-      </w:pPr>
-      <w:r>
-        <w:rPr>
-          <w:rFonts w:asciiTheme="majorBidi" w:hAnsiTheme="majorBidi" w:cstheme="majorBidi"/>
-        </w:rPr>
-        <w:t>78.125 + 842.857142857 + 34.615384615 + 642.857142857 + 93.75 = 1692.204670329.</w:t>
-      </w:r>
-    </w:p>
-    <w:p>
-      <w:pPr>
-        <w:rPr>
-          <w:rFonts w:asciiTheme="majorBidi" w:hAnsiTheme="majorBidi" w:cstheme="majorBidi"/>
-        </w:rPr>
-      </w:pPr>
-      <w:r>
-        <w:rPr>
-          <w:rFonts w:asciiTheme="majorBidi" w:hAnsiTheme="majorBidi" w:cstheme="majorBidi"/>
-        </w:rPr>
-        <w:t>Expected total for all policies: $1,692.205</w:t>
+        <w:t xml:space="preserve">car1: 25000 * 1.10 = 27500 -&gt; 27500/100 + 200 + 20 = 495.0 </w:t>
+      </w:r>
+      <w:r>
+        <w:br/>
+        <w:t xml:space="preserve">car2: 52000 * 1.10 = 57200 -&gt; 57200/50 + 20 + 100 = 1264.0 </w:t>
+      </w:r>
+      <w:r>
+        <w:br/>
+        <w:t xml:space="preserve"> Expected: 495.0 + 1264.0 = 1759.0</w:t>
       </w:r>
     </w:p>
     <w:p>
@@ -3320,7 +3166,7 @@
         <w:rPr>
           <w:rFonts w:asciiTheme="majorBidi" w:hAnsiTheme="majorBidi"/>
         </w:rPr>
-        <w:t>5. Car Price Rise — Alice, 10%</w:t>
+        <w:t xml:space="preserve"> Filtering and Date Logic</w:t>
       </w:r>
     </w:p>
     <w:p>
@@ -3329,11 +3175,19 @@
           <w:rFonts w:asciiTheme="majorBidi" w:hAnsiTheme="majorBidi" w:cstheme="majorBidi"/>
         </w:rPr>
       </w:pPr>
+      <w:proofErr w:type="spellStart"/>
       <w:r>
         <w:rPr>
           <w:rFonts w:asciiTheme="majorBidi" w:hAnsiTheme="majorBidi" w:cstheme="majorBidi"/>
         </w:rPr>
-        <w:t>Toyota Camry: $25,000 × 1.10 = $27,500.</w:t>
+        <w:t>filterByCarModel</w:t>
+      </w:r>
+      <w:proofErr w:type="spellEnd"/>
+      <w:r>
+        <w:rPr>
+          <w:rFonts w:asciiTheme="majorBidi" w:hAnsiTheme="majorBidi" w:cstheme="majorBidi"/>
+        </w:rPr>
+        <w:t>("Toyota"): Toyota Camry and Toyota RAV4 match → expected size = 2.</w:t>
       </w:r>
     </w:p>
     <w:p>
@@ -3342,11 +3196,19 @@
           <w:rFonts w:asciiTheme="majorBidi" w:hAnsiTheme="majorBidi" w:cstheme="majorBidi"/>
         </w:rPr>
       </w:pPr>
+      <w:proofErr w:type="spellStart"/>
       <w:r>
         <w:rPr>
           <w:rFonts w:asciiTheme="majorBidi" w:hAnsiTheme="majorBidi" w:cstheme="majorBidi"/>
         </w:rPr>
-        <w:t>New Camry payment: $27,500 / 320 = $85.9375.</w:t>
+        <w:t>filterByCarModel</w:t>
+      </w:r>
+      <w:proofErr w:type="spellEnd"/>
+      <w:r>
+        <w:rPr>
+          <w:rFonts w:asciiTheme="majorBidi" w:hAnsiTheme="majorBidi" w:cstheme="majorBidi"/>
+        </w:rPr>
+        <w:t>("Tesla"): no matching cars → expected size = 0.</w:t>
       </w:r>
     </w:p>
     <w:p>
@@ -3355,11 +3217,27 @@
           <w:rFonts w:asciiTheme="majorBidi" w:hAnsiTheme="majorBidi" w:cstheme="majorBidi"/>
         </w:rPr>
       </w:pPr>
+      <w:proofErr w:type="spellStart"/>
+      <w:proofErr w:type="gramStart"/>
       <w:r>
         <w:rPr>
           <w:rFonts w:asciiTheme="majorBidi" w:hAnsiTheme="majorBidi" w:cstheme="majorBidi"/>
         </w:rPr>
-        <w:t>BMW X5: $52,000 × 1.10 = $57,200.</w:t>
+        <w:t>filterByExpiryDate</w:t>
+      </w:r>
+      <w:proofErr w:type="spellEnd"/>
+      <w:r>
+        <w:rPr>
+          <w:rFonts w:asciiTheme="majorBidi" w:hAnsiTheme="majorBidi" w:cstheme="majorBidi"/>
+        </w:rPr>
+        <w:t>(</w:t>
+      </w:r>
+      <w:proofErr w:type="gramEnd"/>
+      <w:r>
+        <w:rPr>
+          <w:rFonts w:asciiTheme="majorBidi" w:hAnsiTheme="majorBidi" w:cstheme="majorBidi"/>
+        </w:rPr>
+        <w:t>2025-07-01): policies 101, 201 and 401 are expired → expected size = 3.</w:t>
       </w:r>
     </w:p>
     <w:p>
@@ -3368,112 +3246,19 @@
           <w:rFonts w:asciiTheme="majorBidi" w:hAnsiTheme="majorBidi" w:cstheme="majorBidi"/>
         </w:rPr>
       </w:pPr>
+      <w:proofErr w:type="spellStart"/>
       <w:r>
         <w:rPr>
           <w:rFonts w:asciiTheme="majorBidi" w:hAnsiTheme="majorBidi" w:cstheme="majorBidi"/>
         </w:rPr>
-        <w:t>New BMW payment: $57,200 / 70 + 100 = $917.142857143.</w:t>
-      </w:r>
-    </w:p>
-    <w:p>
-      <w:pPr>
+        <w:t>MyDate.isExpired</w:t>
+      </w:r>
+      <w:proofErr w:type="spellEnd"/>
+      <w:r>
         <w:rPr>
           <w:rFonts w:asciiTheme="majorBidi" w:hAnsiTheme="majorBidi" w:cstheme="majorBidi"/>
         </w:rPr>
-      </w:pPr>
-      <w:r>
-        <w:rPr>
-          <w:rFonts w:asciiTheme="majorBidi" w:hAnsiTheme="majorBidi" w:cstheme="majorBidi"/>
-        </w:rPr>
-        <w:t>New Alice total: $85.9375 + $917.142857143 = $1,003.080357143.</w:t>
-      </w:r>
-    </w:p>
-    <w:p>
-      <w:pPr>
-        <w:rPr>
-          <w:rFonts w:asciiTheme="majorBidi" w:hAnsiTheme="majorBidi" w:cstheme="majorBidi"/>
-        </w:rPr>
-      </w:pPr>
-      <w:r>
-        <w:rPr>
-          <w:rFonts w:asciiTheme="majorBidi" w:hAnsiTheme="majorBidi" w:cstheme="majorBidi"/>
-        </w:rPr>
-        <w:t>Expected result: $1,003.080</w:t>
-      </w:r>
-    </w:p>
-    <w:p>
-      <w:pPr>
-        <w:pStyle w:val="Heading1"/>
-        <w:rPr>
-          <w:rFonts w:asciiTheme="majorBidi" w:hAnsiTheme="majorBidi"/>
-        </w:rPr>
-      </w:pPr>
-      <w:r>
-        <w:rPr>
-          <w:rFonts w:asciiTheme="majorBidi" w:hAnsiTheme="majorBidi"/>
-        </w:rPr>
-        <w:lastRenderedPageBreak/>
-        <w:t xml:space="preserve"> Filtering and Date Logic</w:t>
-      </w:r>
-    </w:p>
-    <w:p>
-      <w:pPr>
-        <w:rPr>
-          <w:rFonts w:asciiTheme="majorBidi" w:hAnsiTheme="majorBidi" w:cstheme="majorBidi"/>
-        </w:rPr>
-      </w:pPr>
-      <w:r>
-        <w:rPr>
-          <w:rFonts w:asciiTheme="majorBidi" w:hAnsiTheme="majorBidi" w:cstheme="majorBidi"/>
-        </w:rPr>
-        <w:t>filterByCarModel("Toyota"): Toyota Camry and Toyota RAV4 match → expected size = 2.</w:t>
-      </w:r>
-    </w:p>
-    <w:p>
-      <w:pPr>
-        <w:rPr>
-          <w:rFonts w:asciiTheme="majorBidi" w:hAnsiTheme="majorBidi" w:cstheme="majorBidi"/>
-        </w:rPr>
-      </w:pPr>
-      <w:r>
-        <w:rPr>
-          <w:rFonts w:asciiTheme="majorBidi" w:hAnsiTheme="majorBidi" w:cstheme="majorBidi"/>
-        </w:rPr>
-        <w:t>filterByCarModel("Tesla"): no matching cars → expected size = 0.</w:t>
-      </w:r>
-    </w:p>
-    <w:p>
-      <w:pPr>
-        <w:rPr>
-          <w:rFonts w:asciiTheme="majorBidi" w:hAnsiTheme="majorBidi" w:cstheme="majorBidi"/>
-        </w:rPr>
-      </w:pPr>
-      <w:proofErr w:type="gramStart"/>
-      <w:r>
-        <w:rPr>
-          <w:rFonts w:asciiTheme="majorBidi" w:hAnsiTheme="majorBidi" w:cstheme="majorBidi"/>
-        </w:rPr>
-        <w:t>filterByExpiryDate(</w:t>
-      </w:r>
-      <w:proofErr w:type="gramEnd"/>
-      <w:r>
-        <w:rPr>
-          <w:rFonts w:asciiTheme="majorBidi" w:hAnsiTheme="majorBidi" w:cstheme="majorBidi"/>
-        </w:rPr>
-        <w:t>2025-07-01): policies 101, 201 and 401 are expired → expected size = 3.</w:t>
-      </w:r>
-    </w:p>
-    <w:p>
-      <w:pPr>
-        <w:rPr>
-          <w:rFonts w:asciiTheme="majorBidi" w:hAnsiTheme="majorBidi" w:cstheme="majorBidi"/>
-        </w:rPr>
-      </w:pPr>
-      <w:r>
-        <w:rPr>
-          <w:rFonts w:asciiTheme="majorBidi" w:hAnsiTheme="majorBidi" w:cstheme="majorBidi"/>
-        </w:rPr>
-        <w:t>MyDate.isExpired: 2025-07-01 vs 2025-06-30 → true; 2024-01-01 vs 2025-06-30 → false; same date 2025-06-30 → true.</w:t>
+        <w:t>: 2025-07-01 vs 2025-06-30 → true; 2024-01-01 vs 2025-06-30 → false; same date 2025-06-30 → true.</w:t>
       </w:r>
     </w:p>
     <w:p>
@@ -3633,11 +3418,19 @@
                 <w:rFonts w:asciiTheme="majorBidi" w:hAnsiTheme="majorBidi" w:cstheme="majorBidi"/>
               </w:rPr>
             </w:pPr>
-            <w:r>
-              <w:rPr>
-                <w:rFonts w:asciiTheme="majorBidi" w:hAnsiTheme="majorBidi" w:cstheme="majorBidi"/>
-              </w:rPr>
-              <w:t>validateAdmin — correct credentials</w:t>
+            <w:proofErr w:type="spellStart"/>
+            <w:r>
+              <w:rPr>
+                <w:rFonts w:asciiTheme="majorBidi" w:hAnsiTheme="majorBidi" w:cstheme="majorBidi"/>
+              </w:rPr>
+              <w:t>validateAdmin</w:t>
+            </w:r>
+            <w:proofErr w:type="spellEnd"/>
+            <w:r>
+              <w:rPr>
+                <w:rFonts w:asciiTheme="majorBidi" w:hAnsiTheme="majorBidi" w:cstheme="majorBidi"/>
+              </w:rPr>
+              <w:t xml:space="preserve"> — correct credentials</w:t>
             </w:r>
           </w:p>
         </w:tc>
@@ -3714,11 +3507,19 @@
                 <w:rFonts w:asciiTheme="majorBidi" w:hAnsiTheme="majorBidi" w:cstheme="majorBidi"/>
               </w:rPr>
             </w:pPr>
-            <w:r>
-              <w:rPr>
-                <w:rFonts w:asciiTheme="majorBidi" w:hAnsiTheme="majorBidi" w:cstheme="majorBidi"/>
-              </w:rPr>
-              <w:t>validateAdmin — wrong password</w:t>
+            <w:proofErr w:type="spellStart"/>
+            <w:r>
+              <w:rPr>
+                <w:rFonts w:asciiTheme="majorBidi" w:hAnsiTheme="majorBidi" w:cstheme="majorBidi"/>
+              </w:rPr>
+              <w:t>validateAdmin</w:t>
+            </w:r>
+            <w:proofErr w:type="spellEnd"/>
+            <w:r>
+              <w:rPr>
+                <w:rFonts w:asciiTheme="majorBidi" w:hAnsiTheme="majorBidi" w:cstheme="majorBidi"/>
+              </w:rPr>
+              <w:t xml:space="preserve"> — wrong password</w:t>
             </w:r>
           </w:p>
         </w:tc>
@@ -3795,11 +3596,19 @@
                 <w:rFonts w:asciiTheme="majorBidi" w:hAnsiTheme="majorBidi" w:cstheme="majorBidi"/>
               </w:rPr>
             </w:pPr>
-            <w:r>
-              <w:rPr>
-                <w:rFonts w:asciiTheme="majorBidi" w:hAnsiTheme="majorBidi" w:cstheme="majorBidi"/>
-              </w:rPr>
-              <w:t>addUser — duplicate ID 1001</w:t>
+            <w:proofErr w:type="spellStart"/>
+            <w:r>
+              <w:rPr>
+                <w:rFonts w:asciiTheme="majorBidi" w:hAnsiTheme="majorBidi" w:cstheme="majorBidi"/>
+              </w:rPr>
+              <w:t>addUser</w:t>
+            </w:r>
+            <w:proofErr w:type="spellEnd"/>
+            <w:r>
+              <w:rPr>
+                <w:rFonts w:asciiTheme="majorBidi" w:hAnsiTheme="majorBidi" w:cstheme="majorBidi"/>
+              </w:rPr>
+              <w:t xml:space="preserve"> — duplicate ID 1001</w:t>
             </w:r>
           </w:p>
         </w:tc>
@@ -3876,11 +3685,19 @@
                 <w:rFonts w:asciiTheme="majorBidi" w:hAnsiTheme="majorBidi" w:cstheme="majorBidi"/>
               </w:rPr>
             </w:pPr>
-            <w:r>
-              <w:rPr>
-                <w:rFonts w:asciiTheme="majorBidi" w:hAnsiTheme="majorBidi" w:cstheme="majorBidi"/>
-              </w:rPr>
-              <w:t>findUser — ID 1001</w:t>
+            <w:proofErr w:type="spellStart"/>
+            <w:r>
+              <w:rPr>
+                <w:rFonts w:asciiTheme="majorBidi" w:hAnsiTheme="majorBidi" w:cstheme="majorBidi"/>
+              </w:rPr>
+              <w:t>findUser</w:t>
+            </w:r>
+            <w:proofErr w:type="spellEnd"/>
+            <w:r>
+              <w:rPr>
+                <w:rFonts w:asciiTheme="majorBidi" w:hAnsiTheme="majorBidi" w:cstheme="majorBidi"/>
+              </w:rPr>
+              <w:t xml:space="preserve"> — ID 1001</w:t>
             </w:r>
           </w:p>
         </w:tc>
@@ -3957,11 +3774,19 @@
                 <w:rFonts w:asciiTheme="majorBidi" w:hAnsiTheme="majorBidi" w:cstheme="majorBidi"/>
               </w:rPr>
             </w:pPr>
-            <w:r>
-              <w:rPr>
-                <w:rFonts w:asciiTheme="majorBidi" w:hAnsiTheme="majorBidi" w:cstheme="majorBidi"/>
-              </w:rPr>
-              <w:t>findUser — ID 9999</w:t>
+            <w:proofErr w:type="spellStart"/>
+            <w:r>
+              <w:rPr>
+                <w:rFonts w:asciiTheme="majorBidi" w:hAnsiTheme="majorBidi" w:cstheme="majorBidi"/>
+              </w:rPr>
+              <w:t>findUser</w:t>
+            </w:r>
+            <w:proofErr w:type="spellEnd"/>
+            <w:r>
+              <w:rPr>
+                <w:rFonts w:asciiTheme="majorBidi" w:hAnsiTheme="majorBidi" w:cstheme="majorBidi"/>
+              </w:rPr>
+              <w:t xml:space="preserve"> — ID 9999</w:t>
             </w:r>
           </w:p>
         </w:tc>
@@ -4038,11 +3863,19 @@
                 <w:rFonts w:asciiTheme="majorBidi" w:hAnsiTheme="majorBidi" w:cstheme="majorBidi"/>
               </w:rPr>
             </w:pPr>
-            <w:r>
-              <w:rPr>
-                <w:rFonts w:asciiTheme="majorBidi" w:hAnsiTheme="majorBidi" w:cstheme="majorBidi"/>
-              </w:rPr>
-              <w:t>findPolicy — 1001 / 101</w:t>
+            <w:proofErr w:type="spellStart"/>
+            <w:r>
+              <w:rPr>
+                <w:rFonts w:asciiTheme="majorBidi" w:hAnsiTheme="majorBidi" w:cstheme="majorBidi"/>
+              </w:rPr>
+              <w:t>findPolicy</w:t>
+            </w:r>
+            <w:proofErr w:type="spellEnd"/>
+            <w:r>
+              <w:rPr>
+                <w:rFonts w:asciiTheme="majorBidi" w:hAnsiTheme="majorBidi" w:cstheme="majorBidi"/>
+              </w:rPr>
+              <w:t xml:space="preserve"> — 1001 / 101</w:t>
             </w:r>
           </w:p>
         </w:tc>
@@ -4119,11 +3952,19 @@
                 <w:rFonts w:asciiTheme="majorBidi" w:hAnsiTheme="majorBidi" w:cstheme="majorBidi"/>
               </w:rPr>
             </w:pPr>
-            <w:r>
-              <w:rPr>
-                <w:rFonts w:asciiTheme="majorBidi" w:hAnsiTheme="majorBidi" w:cstheme="majorBidi"/>
-              </w:rPr>
-              <w:t>findPolicy — 1001 / 9999</w:t>
+            <w:proofErr w:type="spellStart"/>
+            <w:r>
+              <w:rPr>
+                <w:rFonts w:asciiTheme="majorBidi" w:hAnsiTheme="majorBidi" w:cstheme="majorBidi"/>
+              </w:rPr>
+              <w:t>findPolicy</w:t>
+            </w:r>
+            <w:proofErr w:type="spellEnd"/>
+            <w:r>
+              <w:rPr>
+                <w:rFonts w:asciiTheme="majorBidi" w:hAnsiTheme="majorBidi" w:cstheme="majorBidi"/>
+              </w:rPr>
+              <w:t xml:space="preserve"> — 1001 / 9999</w:t>
             </w:r>
           </w:p>
         </w:tc>
@@ -4200,11 +4041,19 @@
                 <w:rFonts w:asciiTheme="majorBidi" w:hAnsiTheme="majorBidi" w:cstheme="majorBidi"/>
               </w:rPr>
             </w:pPr>
-            <w:r>
-              <w:rPr>
-                <w:rFonts w:asciiTheme="majorBidi" w:hAnsiTheme="majorBidi" w:cstheme="majorBidi"/>
-              </w:rPr>
-              <w:t>addPolicy — duplicate ID 101</w:t>
+            <w:proofErr w:type="spellStart"/>
+            <w:r>
+              <w:rPr>
+                <w:rFonts w:asciiTheme="majorBidi" w:hAnsiTheme="majorBidi" w:cstheme="majorBidi"/>
+              </w:rPr>
+              <w:t>addPolicy</w:t>
+            </w:r>
+            <w:proofErr w:type="spellEnd"/>
+            <w:r>
+              <w:rPr>
+                <w:rFonts w:asciiTheme="majorBidi" w:hAnsiTheme="majorBidi" w:cstheme="majorBidi"/>
+              </w:rPr>
+              <w:t xml:space="preserve"> — duplicate ID 101</w:t>
             </w:r>
           </w:p>
         </w:tc>
@@ -4281,12 +4130,14 @@
                 <w:rFonts w:asciiTheme="majorBidi" w:hAnsiTheme="majorBidi" w:cstheme="majorBidi"/>
               </w:rPr>
             </w:pPr>
+            <w:proofErr w:type="spellStart"/>
             <w:r>
               <w:rPr>
                 <w:rFonts w:asciiTheme="majorBidi" w:hAnsiTheme="majorBidi" w:cstheme="majorBidi"/>
               </w:rPr>
               <w:t>ThirdPartyPolicy.calcPayment</w:t>
             </w:r>
+            <w:proofErr w:type="spellEnd"/>
           </w:p>
         </w:tc>
         <w:tc>
@@ -4304,7 +4155,7 @@
               <w:rPr>
                 <w:rFonts w:asciiTheme="majorBidi" w:hAnsiTheme="majorBidi" w:cstheme="majorBidi"/>
               </w:rPr>
-              <w:t>78.125</w:t>
+              <w:t>470.00</w:t>
             </w:r>
           </w:p>
         </w:tc>
@@ -4362,11 +4213,19 @@
                 <w:rFonts w:asciiTheme="majorBidi" w:hAnsiTheme="majorBidi" w:cstheme="majorBidi"/>
               </w:rPr>
             </w:pPr>
-            <w:r>
-              <w:rPr>
-                <w:rFonts w:asciiTheme="majorBidi" w:hAnsiTheme="majorBidi" w:cstheme="majorBidi"/>
-              </w:rPr>
-              <w:t>ComprehensivePolicy.calcPayment — age 35</w:t>
+            <w:proofErr w:type="spellStart"/>
+            <w:r>
+              <w:rPr>
+                <w:rFonts w:asciiTheme="majorBidi" w:hAnsiTheme="majorBidi" w:cstheme="majorBidi"/>
+              </w:rPr>
+              <w:t>ComprehensivePolicy.calcPayment</w:t>
+            </w:r>
+            <w:proofErr w:type="spellEnd"/>
+            <w:r>
+              <w:rPr>
+                <w:rFonts w:asciiTheme="majorBidi" w:hAnsiTheme="majorBidi" w:cstheme="majorBidi"/>
+              </w:rPr>
+              <w:t xml:space="preserve"> — age 35</w:t>
             </w:r>
           </w:p>
         </w:tc>
@@ -4385,7 +4244,7 @@
               <w:rPr>
                 <w:rFonts w:asciiTheme="majorBidi" w:hAnsiTheme="majorBidi" w:cstheme="majorBidi"/>
               </w:rPr>
-              <w:t>742.857143</w:t>
+              <w:t>1060.00</w:t>
             </w:r>
           </w:p>
         </w:tc>
@@ -4443,11 +4302,19 @@
                 <w:rFonts w:asciiTheme="majorBidi" w:hAnsiTheme="majorBidi" w:cstheme="majorBidi"/>
               </w:rPr>
             </w:pPr>
-            <w:r>
-              <w:rPr>
-                <w:rFonts w:asciiTheme="majorBidi" w:hAnsiTheme="majorBidi" w:cstheme="majorBidi"/>
-              </w:rPr>
-              <w:t>ComprehensivePolicy.calcPayment — age 28</w:t>
+            <w:proofErr w:type="spellStart"/>
+            <w:r>
+              <w:rPr>
+                <w:rFonts w:asciiTheme="majorBidi" w:hAnsiTheme="majorBidi" w:cstheme="majorBidi"/>
+              </w:rPr>
+              <w:t>ComprehensivePolicy.calcPayment</w:t>
+            </w:r>
+            <w:proofErr w:type="spellEnd"/>
+            <w:r>
+              <w:rPr>
+                <w:rFonts w:asciiTheme="majorBidi" w:hAnsiTheme="majorBidi" w:cstheme="majorBidi"/>
+              </w:rPr>
+              <w:t xml:space="preserve"> — age 28</w:t>
             </w:r>
           </w:p>
         </w:tc>
@@ -4466,7 +4333,7 @@
               <w:rPr>
                 <w:rFonts w:asciiTheme="majorBidi" w:hAnsiTheme="majorBidi" w:cstheme="majorBidi"/>
               </w:rPr>
-              <w:t>842.857143</w:t>
+              <w:t>1160.00</w:t>
             </w:r>
           </w:p>
         </w:tc>
@@ -4524,12 +4391,20 @@
                 <w:rFonts w:asciiTheme="majorBidi" w:hAnsiTheme="majorBidi" w:cstheme="majorBidi"/>
               </w:rPr>
             </w:pPr>
+            <w:proofErr w:type="spellStart"/>
             <w:proofErr w:type="gramStart"/>
             <w:r>
               <w:rPr>
                 <w:rFonts w:asciiTheme="majorBidi" w:hAnsiTheme="majorBidi" w:cstheme="majorBidi"/>
               </w:rPr>
-              <w:t>calcTotalPayments(</w:t>
+              <w:t>calcTotalPayments</w:t>
+            </w:r>
+            <w:proofErr w:type="spellEnd"/>
+            <w:r>
+              <w:rPr>
+                <w:rFonts w:asciiTheme="majorBidi" w:hAnsiTheme="majorBidi" w:cstheme="majorBidi"/>
+              </w:rPr>
+              <w:t>(</w:t>
             </w:r>
             <w:proofErr w:type="gramEnd"/>
             <w:r>
@@ -4555,7 +4430,7 @@
               <w:rPr>
                 <w:rFonts w:asciiTheme="majorBidi" w:hAnsiTheme="majorBidi" w:cstheme="majorBidi"/>
               </w:rPr>
-              <w:t>920.982143</w:t>
+              <w:t>470.00</w:t>
             </w:r>
           </w:p>
         </w:tc>
@@ -4613,12 +4488,20 @@
                 <w:rFonts w:asciiTheme="majorBidi" w:hAnsiTheme="majorBidi" w:cstheme="majorBidi"/>
               </w:rPr>
             </w:pPr>
+            <w:proofErr w:type="spellStart"/>
             <w:proofErr w:type="gramStart"/>
             <w:r>
               <w:rPr>
                 <w:rFonts w:asciiTheme="majorBidi" w:hAnsiTheme="majorBidi" w:cstheme="majorBidi"/>
               </w:rPr>
-              <w:t>calcTotalPayments(</w:t>
+              <w:t>calcTotalPayments</w:t>
+            </w:r>
+            <w:proofErr w:type="spellEnd"/>
+            <w:r>
+              <w:rPr>
+                <w:rFonts w:asciiTheme="majorBidi" w:hAnsiTheme="majorBidi" w:cstheme="majorBidi"/>
+              </w:rPr>
+              <w:t>(</w:t>
             </w:r>
             <w:proofErr w:type="gramEnd"/>
             <w:r>
@@ -4644,7 +4527,7 @@
               <w:rPr>
                 <w:rFonts w:asciiTheme="majorBidi" w:hAnsiTheme="majorBidi" w:cstheme="majorBidi"/>
               </w:rPr>
-              <w:t>1692.204670</w:t>
+              <w:t>3670.00</w:t>
             </w:r>
           </w:p>
         </w:tc>
@@ -4702,11 +4585,19 @@
                 <w:rFonts w:asciiTheme="majorBidi" w:hAnsiTheme="majorBidi" w:cstheme="majorBidi"/>
               </w:rPr>
             </w:pPr>
-            <w:r>
-              <w:rPr>
-                <w:rFonts w:asciiTheme="majorBidi" w:hAnsiTheme="majorBidi" w:cstheme="majorBidi"/>
-              </w:rPr>
-              <w:t>filterByCarModel("Toyota")</w:t>
+            <w:proofErr w:type="spellStart"/>
+            <w:r>
+              <w:rPr>
+                <w:rFonts w:asciiTheme="majorBidi" w:hAnsiTheme="majorBidi" w:cstheme="majorBidi"/>
+              </w:rPr>
+              <w:t>filterByCarModel</w:t>
+            </w:r>
+            <w:proofErr w:type="spellEnd"/>
+            <w:r>
+              <w:rPr>
+                <w:rFonts w:asciiTheme="majorBidi" w:hAnsiTheme="majorBidi" w:cstheme="majorBidi"/>
+              </w:rPr>
+              <w:t>("Toyota")</w:t>
             </w:r>
           </w:p>
         </w:tc>
@@ -4783,11 +4674,19 @@
                 <w:rFonts w:asciiTheme="majorBidi" w:hAnsiTheme="majorBidi" w:cstheme="majorBidi"/>
               </w:rPr>
             </w:pPr>
-            <w:r>
-              <w:rPr>
-                <w:rFonts w:asciiTheme="majorBidi" w:hAnsiTheme="majorBidi" w:cstheme="majorBidi"/>
-              </w:rPr>
-              <w:t>filterByCarModel("Tesla")</w:t>
+            <w:proofErr w:type="spellStart"/>
+            <w:r>
+              <w:rPr>
+                <w:rFonts w:asciiTheme="majorBidi" w:hAnsiTheme="majorBidi" w:cstheme="majorBidi"/>
+              </w:rPr>
+              <w:t>filterByCarModel</w:t>
+            </w:r>
+            <w:proofErr w:type="spellEnd"/>
+            <w:r>
+              <w:rPr>
+                <w:rFonts w:asciiTheme="majorBidi" w:hAnsiTheme="majorBidi" w:cstheme="majorBidi"/>
+              </w:rPr>
+              <w:t>("Tesla")</w:t>
             </w:r>
           </w:p>
         </w:tc>
@@ -4864,12 +4763,20 @@
                 <w:rFonts w:asciiTheme="majorBidi" w:hAnsiTheme="majorBidi" w:cstheme="majorBidi"/>
               </w:rPr>
             </w:pPr>
+            <w:proofErr w:type="spellStart"/>
             <w:proofErr w:type="gramStart"/>
             <w:r>
               <w:rPr>
                 <w:rFonts w:asciiTheme="majorBidi" w:hAnsiTheme="majorBidi" w:cstheme="majorBidi"/>
               </w:rPr>
-              <w:t>filterByExpiryDate(</w:t>
+              <w:t>filterByExpiryDate</w:t>
+            </w:r>
+            <w:proofErr w:type="spellEnd"/>
+            <w:r>
+              <w:rPr>
+                <w:rFonts w:asciiTheme="majorBidi" w:hAnsiTheme="majorBidi" w:cstheme="majorBidi"/>
+              </w:rPr>
+              <w:t>(</w:t>
             </w:r>
             <w:proofErr w:type="gramEnd"/>
             <w:r>
@@ -4953,12 +4860,20 @@
                 <w:rFonts w:asciiTheme="majorBidi" w:hAnsiTheme="majorBidi" w:cstheme="majorBidi"/>
               </w:rPr>
             </w:pPr>
+            <w:proofErr w:type="spellStart"/>
             <w:proofErr w:type="gramStart"/>
             <w:r>
               <w:rPr>
                 <w:rFonts w:asciiTheme="majorBidi" w:hAnsiTheme="majorBidi" w:cstheme="majorBidi"/>
               </w:rPr>
-              <w:t>allPolicies(</w:t>
+              <w:t>allPolicies</w:t>
+            </w:r>
+            <w:proofErr w:type="spellEnd"/>
+            <w:r>
+              <w:rPr>
+                <w:rFonts w:asciiTheme="majorBidi" w:hAnsiTheme="majorBidi" w:cstheme="majorBidi"/>
+              </w:rPr>
+              <w:t>(</w:t>
             </w:r>
             <w:proofErr w:type="gramEnd"/>
             <w:r>
@@ -5042,12 +4957,20 @@
                 <w:rFonts w:asciiTheme="majorBidi" w:hAnsiTheme="majorBidi" w:cstheme="majorBidi"/>
               </w:rPr>
             </w:pPr>
+            <w:proofErr w:type="spellStart"/>
             <w:proofErr w:type="gramStart"/>
             <w:r>
               <w:rPr>
                 <w:rFonts w:asciiTheme="majorBidi" w:hAnsiTheme="majorBidi" w:cstheme="majorBidi"/>
               </w:rPr>
-              <w:t>carPriceRise(</w:t>
+              <w:t>carPriceRise</w:t>
+            </w:r>
+            <w:proofErr w:type="spellEnd"/>
+            <w:r>
+              <w:rPr>
+                <w:rFonts w:asciiTheme="majorBidi" w:hAnsiTheme="majorBidi" w:cstheme="majorBidi"/>
+              </w:rPr>
+              <w:t>(</w:t>
             </w:r>
             <w:proofErr w:type="gramEnd"/>
             <w:r>
@@ -5073,7 +4996,7 @@
               <w:rPr>
                 <w:rFonts w:asciiTheme="majorBidi" w:hAnsiTheme="majorBidi" w:cstheme="majorBidi"/>
               </w:rPr>
-              <w:t>1003.080357</w:t>
+              <w:t>17590.00</w:t>
             </w:r>
           </w:p>
         </w:tc>
@@ -5116,6 +5039,7 @@
               <w:rPr>
                 <w:rFonts w:asciiTheme="majorBidi" w:hAnsiTheme="majorBidi" w:cstheme="majorBidi"/>
               </w:rPr>
+              <w:lastRenderedPageBreak/>
               <w:t>19</w:t>
             </w:r>
           </w:p>
@@ -5131,11 +5055,19 @@
                 <w:rFonts w:asciiTheme="majorBidi" w:hAnsiTheme="majorBidi" w:cstheme="majorBidi"/>
               </w:rPr>
             </w:pPr>
-            <w:r>
-              <w:rPr>
-                <w:rFonts w:asciiTheme="majorBidi" w:hAnsiTheme="majorBidi" w:cstheme="majorBidi"/>
-              </w:rPr>
-              <w:t>MyDate.isExpired — expired</w:t>
+            <w:proofErr w:type="spellStart"/>
+            <w:r>
+              <w:rPr>
+                <w:rFonts w:asciiTheme="majorBidi" w:hAnsiTheme="majorBidi" w:cstheme="majorBidi"/>
+              </w:rPr>
+              <w:t>MyDate.isExpired</w:t>
+            </w:r>
+            <w:proofErr w:type="spellEnd"/>
+            <w:r>
+              <w:rPr>
+                <w:rFonts w:asciiTheme="majorBidi" w:hAnsiTheme="majorBidi" w:cstheme="majorBidi"/>
+              </w:rPr>
+              <w:t xml:space="preserve"> — expired</w:t>
             </w:r>
           </w:p>
         </w:tc>
@@ -5212,11 +5144,19 @@
                 <w:rFonts w:asciiTheme="majorBidi" w:hAnsiTheme="majorBidi" w:cstheme="majorBidi"/>
               </w:rPr>
             </w:pPr>
-            <w:r>
-              <w:rPr>
-                <w:rFonts w:asciiTheme="majorBidi" w:hAnsiTheme="majorBidi" w:cstheme="majorBidi"/>
-              </w:rPr>
-              <w:t>MyDate.isExpired — valid</w:t>
+            <w:proofErr w:type="spellStart"/>
+            <w:r>
+              <w:rPr>
+                <w:rFonts w:asciiTheme="majorBidi" w:hAnsiTheme="majorBidi" w:cstheme="majorBidi"/>
+              </w:rPr>
+              <w:t>MyDate.isExpired</w:t>
+            </w:r>
+            <w:proofErr w:type="spellEnd"/>
+            <w:r>
+              <w:rPr>
+                <w:rFonts w:asciiTheme="majorBidi" w:hAnsiTheme="majorBidi" w:cstheme="majorBidi"/>
+              </w:rPr>
+              <w:t xml:space="preserve"> — valid</w:t>
             </w:r>
           </w:p>
         </w:tc>
@@ -5293,11 +5233,19 @@
                 <w:rFonts w:asciiTheme="majorBidi" w:hAnsiTheme="majorBidi" w:cstheme="majorBidi"/>
               </w:rPr>
             </w:pPr>
-            <w:r>
-              <w:rPr>
-                <w:rFonts w:asciiTheme="majorBidi" w:hAnsiTheme="majorBidi" w:cstheme="majorBidi"/>
-              </w:rPr>
-              <w:t>MyDate.isExpired — same day</w:t>
+            <w:proofErr w:type="spellStart"/>
+            <w:r>
+              <w:rPr>
+                <w:rFonts w:asciiTheme="majorBidi" w:hAnsiTheme="majorBidi" w:cstheme="majorBidi"/>
+              </w:rPr>
+              <w:t>MyDate.isExpired</w:t>
+            </w:r>
+            <w:proofErr w:type="spellEnd"/>
+            <w:r>
+              <w:rPr>
+                <w:rFonts w:asciiTheme="majorBidi" w:hAnsiTheme="majorBidi" w:cstheme="majorBidi"/>
+              </w:rPr>
+              <w:t xml:space="preserve"> — same day</w:t>
             </w:r>
           </w:p>
         </w:tc>
@@ -5799,6 +5747,65 @@
           <w:ilvl w:val="0"/>
           <w:numId w:val="10"/>
         </w:numPr>
+      </w:pPr>
+      <w:r>
+        <w:br/>
+        <w:t xml:space="preserve"> Wollongong includes: </w:t>
+      </w:r>
+      <w:r>
+        <w:br/>
+        <w:t xml:space="preserve"> Alice (1001, post-rise): 1759.0 </w:t>
+      </w:r>
+      <w:r>
+        <w:br/>
+        <w:t xml:space="preserve"> Diana (1004): 30000/100 + 1*200 + 20 = 520.0 </w:t>
+      </w:r>
+      <w:r>
+        <w:br/>
+        <w:t xml:space="preserve"> Expected: 1759.0 + 520.0 = 2279.0 </w:t>
+      </w:r>
+      <w:r>
+        <w:br/>
+      </w:r>
+    </w:p>
+    <w:p>
+      <w:pPr>
+        <w:pStyle w:val="NormalWeb"/>
+        <w:numPr>
+          <w:ilvl w:val="0"/>
+          <w:numId w:val="10"/>
+        </w:numPr>
+      </w:pPr>
+      <w:r>
+        <w:t xml:space="preserve"> Shiraz includes: </w:t>
+      </w:r>
+      <w:r>
+        <w:br/>
+        <w:t xml:space="preserve"> Bob (1002): 18000/100 + 2*200 + 20 = 600.0 </w:t>
+      </w:r>
+      <w:r>
+        <w:br/>
+        <w:t xml:space="preserve"> Charlie (1003): 45000/50 + 0*200 + 20 = 920.0 </w:t>
+      </w:r>
+      <w:r>
+        <w:br/>
+        <w:t xml:space="preserve"> Ethan (1005): 0 policies = 0.0 </w:t>
+      </w:r>
+      <w:r>
+        <w:br/>
+        <w:t xml:space="preserve"> Expected: 600.0 + 920.0 = 1520.0 </w:t>
+      </w:r>
+      <w:r>
+        <w:br/>
+      </w:r>
+    </w:p>
+    <w:p>
+      <w:pPr>
+        <w:pStyle w:val="NormalWeb"/>
+        <w:numPr>
+          <w:ilvl w:val="0"/>
+          <w:numId w:val="10"/>
+        </w:numPr>
         <w:spacing w:before="0" w:beforeAutospacing="0"/>
         <w:rPr>
           <w:rFonts w:asciiTheme="majorBidi" w:hAnsiTheme="majorBidi" w:cstheme="majorBidi"/>
@@ -5826,7 +5833,7 @@
           <w:sz w:val="22"/>
           <w:szCs w:val="22"/>
         </w:rPr>
-        <w:t>("Wollongong")</w:t>
+        <w:t>("Melbourne")</w:t>
       </w:r>
     </w:p>
     <w:p>
@@ -5846,12 +5853,63 @@
       <w:r>
         <w:rPr>
           <w:rFonts w:asciiTheme="majorBidi" w:hAnsiTheme="majorBidi" w:cstheme="majorBidi"/>
-          <w:i/>
-          <w:iCs/>
           <w:sz w:val="22"/>
           <w:szCs w:val="22"/>
         </w:rPr>
-        <w:t>Note: the 10% car price rise applied to Alice in Test 18.</w:t>
+        <w:t xml:space="preserve">No users registered under </w:t>
+      </w:r>
+      <w:proofErr w:type="gramStart"/>
+      <w:r>
+        <w:rPr>
+          <w:rFonts w:asciiTheme="majorBidi" w:hAnsiTheme="majorBidi" w:cstheme="majorBidi"/>
+          <w:sz w:val="22"/>
+          <w:szCs w:val="22"/>
+        </w:rPr>
+        <w:t xml:space="preserve">Melbourne </w:t>
+      </w:r>
+      <w:r>
+        <w:rPr>
+          <w:rStyle w:val="math-inline"/>
+          <w:rFonts w:asciiTheme="majorBidi" w:hAnsiTheme="majorBidi" w:cstheme="majorBidi"/>
+          <w:sz w:val="22"/>
+          <w:szCs w:val="22"/>
+        </w:rPr>
+        <w:t>:</w:t>
+      </w:r>
+      <w:proofErr w:type="gramEnd"/>
+      <w:r>
+        <w:rPr>
+          <w:rStyle w:val="math-inline"/>
+          <w:rFonts w:asciiTheme="majorBidi" w:hAnsiTheme="majorBidi" w:cstheme="majorBidi"/>
+          <w:sz w:val="22"/>
+          <w:szCs w:val="22"/>
+        </w:rPr>
+        <w:t xml:space="preserve"> </w:t>
+      </w:r>
+      <w:r>
+        <w:rPr>
+          <w:rFonts w:asciiTheme="majorBidi" w:hAnsiTheme="majorBidi" w:cstheme="majorBidi"/>
+          <w:sz w:val="22"/>
+          <w:szCs w:val="22"/>
+        </w:rPr>
+        <w:t xml:space="preserve">returns </w:t>
+      </w:r>
+      <w:r>
+        <w:rPr>
+          <w:rStyle w:val="math-inline"/>
+          <w:rFonts w:asciiTheme="majorBidi" w:hAnsiTheme="majorBidi" w:cstheme="majorBidi"/>
+          <w:sz w:val="22"/>
+          <w:szCs w:val="22"/>
+        </w:rPr>
+        <w:t>$0.0$</w:t>
+      </w:r>
+      <w:r>
+        <w:rPr>
+          <w:rFonts w:asciiTheme="majorBidi" w:hAnsiTheme="majorBidi" w:cstheme="majorBidi"/>
+          <w:sz w:val="22"/>
+          <w:szCs w:val="22"/>
+        </w:rPr>
+        <w:t>.</w:t>
       </w:r>
     </w:p>
     <w:p>
@@ -5876,38 +5934,7 @@
           <w:sz w:val="22"/>
           <w:szCs w:val="22"/>
         </w:rPr>
-        <w:t>Alice (1001)</w:t>
-      </w:r>
-      <w:r>
-        <w:rPr>
-          <w:rFonts w:asciiTheme="majorBidi" w:hAnsiTheme="majorBidi" w:cstheme="majorBidi"/>
-          <w:sz w:val="22"/>
-          <w:szCs w:val="22"/>
-        </w:rPr>
-        <w:t>:</w:t>
-      </w:r>
-    </w:p>
-    <w:p>
-      <w:pPr>
-        <w:pStyle w:val="NormalWeb"/>
-        <w:numPr>
-          <w:ilvl w:val="2"/>
-          <w:numId w:val="10"/>
-        </w:numPr>
-        <w:spacing w:before="0" w:beforeAutospacing="0"/>
-        <w:rPr>
-          <w:rFonts w:asciiTheme="majorBidi" w:hAnsiTheme="majorBidi" w:cstheme="majorBidi"/>
-          <w:sz w:val="22"/>
-          <w:szCs w:val="22"/>
-        </w:rPr>
-      </w:pPr>
-      <w:r>
-        <w:rPr>
-          <w:rFonts w:asciiTheme="majorBidi" w:hAnsiTheme="majorBidi" w:cstheme="majorBidi"/>
-          <w:sz w:val="22"/>
-          <w:szCs w:val="22"/>
-        </w:rPr>
-        <w:t xml:space="preserve">Policy 101 (Camry, post-rise $27,500): </w:t>
+        <w:t>Expected result:</w:t>
       </w:r>
       <w:r>
         <w:rPr>
@@ -5916,30 +5943,7 @@
           <w:sz w:val="22"/>
           <w:szCs w:val="22"/>
         </w:rPr>
-        <w:t>$27,500 / 320 = \$85.9375$</w:t>
-      </w:r>
-    </w:p>
-    <w:p>
-      <w:pPr>
-        <w:pStyle w:val="NormalWeb"/>
-        <w:numPr>
-          <w:ilvl w:val="2"/>
-          <w:numId w:val="10"/>
-        </w:numPr>
-        <w:spacing w:before="0" w:beforeAutospacing="0"/>
-        <w:rPr>
-          <w:rFonts w:asciiTheme="majorBidi" w:hAnsiTheme="majorBidi" w:cstheme="majorBidi"/>
-          <w:sz w:val="22"/>
-          <w:szCs w:val="22"/>
-        </w:rPr>
-      </w:pPr>
-      <w:r>
-        <w:rPr>
-          <w:rFonts w:asciiTheme="majorBidi" w:hAnsiTheme="majorBidi" w:cstheme="majorBidi"/>
-          <w:sz w:val="22"/>
-          <w:szCs w:val="22"/>
-        </w:rPr>
-        <w:t xml:space="preserve">Policy 102 (BMW X5, post-rise $57,200): </w:t>
+        <w:t xml:space="preserve"> </w:t>
       </w:r>
       <w:r>
         <w:rPr>
@@ -5948,31 +5952,7 @@
           <w:sz w:val="22"/>
           <w:szCs w:val="22"/>
         </w:rPr>
-        <w:t>$57,200 / 70 + 100 = \$917.142857143$</w:t>
-      </w:r>
-    </w:p>
-    <w:p>
-      <w:pPr>
-        <w:pStyle w:val="NormalWeb"/>
-        <w:numPr>
-          <w:ilvl w:val="2"/>
-          <w:numId w:val="10"/>
-        </w:numPr>
-        <w:spacing w:before="0" w:beforeAutospacing="0"/>
-        <w:rPr>
-          <w:rFonts w:asciiTheme="majorBidi" w:hAnsiTheme="majorBidi" w:cstheme="majorBidi"/>
-          <w:sz w:val="22"/>
-          <w:szCs w:val="22"/>
-        </w:rPr>
-      </w:pPr>
-      <w:r>
-        <w:rPr>
-          <w:rFonts w:asciiTheme="majorBidi" w:hAnsiTheme="majorBidi" w:cstheme="majorBidi"/>
-          <w:sz w:val="22"/>
-          <w:szCs w:val="22"/>
-        </w:rPr>
-        <w:lastRenderedPageBreak/>
-        <w:t xml:space="preserve">Alice Subtotal: </w:t>
+        <w:t xml:space="preserve"> </w:t>
       </w:r>
       <w:r>
         <w:rPr>
@@ -5981,634 +5961,7 @@
           <w:sz w:val="22"/>
           <w:szCs w:val="22"/>
         </w:rPr>
-        <w:t>$\$1,003.080357143$</w:t>
-      </w:r>
-      <w:r>
-        <w:rPr>
-          <w:rStyle w:val="math-inline"/>
-          <w:rFonts w:asciiTheme="majorBidi" w:hAnsiTheme="majorBidi" w:cstheme="majorBidi"/>
-          <w:sz w:val="22"/>
-          <w:szCs w:val="22"/>
-        </w:rPr>
-        <w:br/>
-      </w:r>
-    </w:p>
-    <w:p>
-      <w:pPr>
-        <w:pStyle w:val="NormalWeb"/>
-        <w:numPr>
-          <w:ilvl w:val="1"/>
-          <w:numId w:val="10"/>
-        </w:numPr>
-        <w:spacing w:before="0" w:beforeAutospacing="0"/>
-        <w:rPr>
-          <w:rFonts w:asciiTheme="majorBidi" w:hAnsiTheme="majorBidi" w:cstheme="majorBidi"/>
-          <w:sz w:val="22"/>
-          <w:szCs w:val="22"/>
-        </w:rPr>
-      </w:pPr>
-      <w:r>
-        <w:rPr>
-          <w:rFonts w:asciiTheme="majorBidi" w:hAnsiTheme="majorBidi" w:cstheme="majorBidi"/>
-          <w:b/>
-          <w:bCs/>
-          <w:sz w:val="22"/>
-          <w:szCs w:val="22"/>
-        </w:rPr>
-        <w:t>Diana (1004)</w:t>
-      </w:r>
-      <w:r>
-        <w:rPr>
-          <w:rFonts w:asciiTheme="majorBidi" w:hAnsiTheme="majorBidi" w:cstheme="majorBidi"/>
-          <w:sz w:val="22"/>
-          <w:szCs w:val="22"/>
-        </w:rPr>
-        <w:t>:</w:t>
-      </w:r>
-    </w:p>
-    <w:p>
-      <w:pPr>
-        <w:pStyle w:val="NormalWeb"/>
-        <w:numPr>
-          <w:ilvl w:val="2"/>
-          <w:numId w:val="10"/>
-        </w:numPr>
-        <w:spacing w:before="0" w:beforeAutospacing="0"/>
-        <w:rPr>
-          <w:rFonts w:asciiTheme="majorBidi" w:hAnsiTheme="majorBidi" w:cstheme="majorBidi"/>
-          <w:sz w:val="22"/>
-          <w:szCs w:val="22"/>
-        </w:rPr>
-      </w:pPr>
-      <w:r>
-        <w:rPr>
-          <w:rFonts w:asciiTheme="majorBidi" w:hAnsiTheme="majorBidi" w:cstheme="majorBidi"/>
-          <w:sz w:val="22"/>
-          <w:szCs w:val="22"/>
-        </w:rPr>
-        <w:t xml:space="preserve">Policy 401 (Mazda 3, $30,000): </w:t>
-      </w:r>
-      <w:r>
-        <w:rPr>
-          <w:rStyle w:val="math-inline"/>
-          <w:rFonts w:asciiTheme="majorBidi" w:hAnsiTheme="majorBidi" w:cstheme="majorBidi"/>
-          <w:sz w:val="22"/>
-          <w:szCs w:val="22"/>
-        </w:rPr>
-        <w:t>$30,000 / 320 = \$93.750$</w:t>
-      </w:r>
-    </w:p>
-    <w:p>
-      <w:pPr>
-        <w:pStyle w:val="NormalWeb"/>
-        <w:numPr>
-          <w:ilvl w:val="1"/>
-          <w:numId w:val="10"/>
-        </w:numPr>
-        <w:spacing w:before="0" w:beforeAutospacing="0"/>
-        <w:rPr>
-          <w:rFonts w:asciiTheme="majorBidi" w:hAnsiTheme="majorBidi" w:cstheme="majorBidi"/>
-          <w:sz w:val="22"/>
-          <w:szCs w:val="22"/>
-        </w:rPr>
-      </w:pPr>
-      <w:r>
-        <w:rPr>
-          <w:rFonts w:asciiTheme="majorBidi" w:hAnsiTheme="majorBidi" w:cstheme="majorBidi"/>
-          <w:sz w:val="22"/>
-          <w:szCs w:val="22"/>
-        </w:rPr>
-        <w:t xml:space="preserve">Total for Wollongong: </w:t>
-      </w:r>
-      <w:r>
-        <w:rPr>
-          <w:rStyle w:val="math-inline"/>
-          <w:rFonts w:asciiTheme="majorBidi" w:hAnsiTheme="majorBidi" w:cstheme="majorBidi"/>
-          <w:sz w:val="22"/>
-          <w:szCs w:val="22"/>
-        </w:rPr>
-        <w:t>$1,003.080357143 + 93.75 = 1,096.830357143$</w:t>
-      </w:r>
-    </w:p>
-    <w:p>
-      <w:pPr>
-        <w:pStyle w:val="NormalWeb"/>
-        <w:numPr>
-          <w:ilvl w:val="1"/>
-          <w:numId w:val="10"/>
-        </w:numPr>
-        <w:spacing w:before="0" w:beforeAutospacing="0"/>
-        <w:rPr>
-          <w:rFonts w:asciiTheme="majorBidi" w:hAnsiTheme="majorBidi" w:cstheme="majorBidi"/>
-          <w:sz w:val="22"/>
-          <w:szCs w:val="22"/>
-        </w:rPr>
-      </w:pPr>
-      <w:r>
-        <w:rPr>
-          <w:rFonts w:asciiTheme="majorBidi" w:hAnsiTheme="majorBidi" w:cstheme="majorBidi"/>
-          <w:b/>
-          <w:bCs/>
-          <w:sz w:val="22"/>
-          <w:szCs w:val="22"/>
-        </w:rPr>
-        <w:t>Expected result:</w:t>
-      </w:r>
-      <w:r>
-        <w:rPr>
-          <w:rFonts w:asciiTheme="majorBidi" w:hAnsiTheme="majorBidi" w:cstheme="majorBidi"/>
-          <w:sz w:val="22"/>
-          <w:szCs w:val="22"/>
-        </w:rPr>
-        <w:t xml:space="preserve"> </w:t>
-      </w:r>
-      <w:r>
-        <w:rPr>
-          <w:rStyle w:val="math-inline"/>
-          <w:rFonts w:asciiTheme="majorBidi" w:hAnsiTheme="majorBidi" w:cstheme="majorBidi"/>
-          <w:sz w:val="22"/>
-          <w:szCs w:val="22"/>
-        </w:rPr>
-        <w:t>$\$1,096.830$</w:t>
-      </w:r>
-      <w:r>
-        <w:rPr>
-          <w:rStyle w:val="math-inline"/>
-          <w:rFonts w:asciiTheme="majorBidi" w:hAnsiTheme="majorBidi" w:cstheme="majorBidi"/>
-          <w:sz w:val="22"/>
-          <w:szCs w:val="22"/>
-        </w:rPr>
-        <w:br/>
-      </w:r>
-    </w:p>
-    <w:p>
-      <w:pPr>
-        <w:pStyle w:val="NormalWeb"/>
-        <w:numPr>
-          <w:ilvl w:val="0"/>
-          <w:numId w:val="10"/>
-        </w:numPr>
-        <w:spacing w:before="0" w:beforeAutospacing="0"/>
-        <w:rPr>
-          <w:rFonts w:asciiTheme="majorBidi" w:hAnsiTheme="majorBidi" w:cstheme="majorBidi"/>
-          <w:sz w:val="22"/>
-          <w:szCs w:val="22"/>
-        </w:rPr>
-      </w:pPr>
-      <w:proofErr w:type="spellStart"/>
-      <w:r>
-        <w:rPr>
-          <w:rFonts w:asciiTheme="majorBidi" w:hAnsiTheme="majorBidi" w:cstheme="majorBidi"/>
-          <w:b/>
-          <w:bCs/>
-          <w:sz w:val="22"/>
-          <w:szCs w:val="22"/>
-        </w:rPr>
-        <w:t>getTotalPaymentForCity</w:t>
-      </w:r>
-      <w:proofErr w:type="spellEnd"/>
-      <w:r>
-        <w:rPr>
-          <w:rFonts w:asciiTheme="majorBidi" w:hAnsiTheme="majorBidi" w:cstheme="majorBidi"/>
-          <w:b/>
-          <w:bCs/>
-          <w:sz w:val="22"/>
-          <w:szCs w:val="22"/>
-        </w:rPr>
-        <w:t>("Shiraz")</w:t>
-      </w:r>
-    </w:p>
-    <w:p>
-      <w:pPr>
-        <w:pStyle w:val="NormalWeb"/>
-        <w:numPr>
-          <w:ilvl w:val="1"/>
-          <w:numId w:val="10"/>
-        </w:numPr>
-        <w:spacing w:before="0" w:beforeAutospacing="0"/>
-        <w:rPr>
-          <w:rFonts w:asciiTheme="majorBidi" w:hAnsiTheme="majorBidi" w:cstheme="majorBidi"/>
-          <w:sz w:val="22"/>
-          <w:szCs w:val="22"/>
-        </w:rPr>
-      </w:pPr>
-      <w:r>
-        <w:rPr>
-          <w:rFonts w:asciiTheme="majorBidi" w:hAnsiTheme="majorBidi" w:cstheme="majorBidi"/>
-          <w:b/>
-          <w:bCs/>
-          <w:sz w:val="22"/>
-          <w:szCs w:val="22"/>
-        </w:rPr>
-        <w:t>Bob (1002)</w:t>
-      </w:r>
-      <w:r>
-        <w:rPr>
-          <w:rFonts w:asciiTheme="majorBidi" w:hAnsiTheme="majorBidi" w:cstheme="majorBidi"/>
-          <w:sz w:val="22"/>
-          <w:szCs w:val="22"/>
-        </w:rPr>
-        <w:t>:</w:t>
-      </w:r>
-    </w:p>
-    <w:p>
-      <w:pPr>
-        <w:pStyle w:val="NormalWeb"/>
-        <w:numPr>
-          <w:ilvl w:val="2"/>
-          <w:numId w:val="10"/>
-        </w:numPr>
-        <w:spacing w:before="0" w:beforeAutospacing="0"/>
-        <w:rPr>
-          <w:rFonts w:asciiTheme="majorBidi" w:hAnsiTheme="majorBidi" w:cstheme="majorBidi"/>
-          <w:sz w:val="22"/>
-          <w:szCs w:val="22"/>
-        </w:rPr>
-      </w:pPr>
-      <w:r>
-        <w:rPr>
-          <w:rFonts w:asciiTheme="majorBidi" w:hAnsiTheme="majorBidi" w:cstheme="majorBidi"/>
-          <w:sz w:val="22"/>
-          <w:szCs w:val="22"/>
-        </w:rPr>
-        <w:t xml:space="preserve">Policy 201 (Civic, $18,000): </w:t>
-      </w:r>
-      <w:r>
-        <w:rPr>
-          <w:rStyle w:val="math-inline"/>
-          <w:rFonts w:asciiTheme="majorBidi" w:hAnsiTheme="majorBidi" w:cstheme="majorBidi"/>
-          <w:sz w:val="22"/>
-          <w:szCs w:val="22"/>
-        </w:rPr>
-        <w:t>$18,000 / 520 = \$34.615384615$</w:t>
-      </w:r>
-    </w:p>
-    <w:p>
-      <w:pPr>
-        <w:pStyle w:val="NormalWeb"/>
-        <w:numPr>
-          <w:ilvl w:val="1"/>
-          <w:numId w:val="10"/>
-        </w:numPr>
-        <w:spacing w:before="0" w:beforeAutospacing="0"/>
-        <w:rPr>
-          <w:rFonts w:asciiTheme="majorBidi" w:hAnsiTheme="majorBidi" w:cstheme="majorBidi"/>
-          <w:sz w:val="22"/>
-          <w:szCs w:val="22"/>
-        </w:rPr>
-      </w:pPr>
-      <w:r>
-        <w:rPr>
-          <w:rFonts w:asciiTheme="majorBidi" w:hAnsiTheme="majorBidi" w:cstheme="majorBidi"/>
-          <w:b/>
-          <w:bCs/>
-          <w:sz w:val="22"/>
-          <w:szCs w:val="22"/>
-        </w:rPr>
-        <w:t>Charlie (1003)</w:t>
-      </w:r>
-      <w:r>
-        <w:rPr>
-          <w:rFonts w:asciiTheme="majorBidi" w:hAnsiTheme="majorBidi" w:cstheme="majorBidi"/>
-          <w:sz w:val="22"/>
-          <w:szCs w:val="22"/>
-        </w:rPr>
-        <w:t>:</w:t>
-      </w:r>
-    </w:p>
-    <w:p>
-      <w:pPr>
-        <w:pStyle w:val="NormalWeb"/>
-        <w:numPr>
-          <w:ilvl w:val="2"/>
-          <w:numId w:val="10"/>
-        </w:numPr>
-        <w:spacing w:before="0" w:beforeAutospacing="0"/>
-        <w:rPr>
-          <w:rFonts w:asciiTheme="majorBidi" w:hAnsiTheme="majorBidi" w:cstheme="majorBidi"/>
-          <w:sz w:val="22"/>
-          <w:szCs w:val="22"/>
-        </w:rPr>
-      </w:pPr>
-      <w:r>
-        <w:rPr>
-          <w:rFonts w:asciiTheme="majorBidi" w:hAnsiTheme="majorBidi" w:cstheme="majorBidi"/>
-          <w:sz w:val="22"/>
-          <w:szCs w:val="22"/>
-        </w:rPr>
-        <w:t xml:space="preserve">Policy 301 (RAV4, $45,000): </w:t>
-      </w:r>
-      <w:r>
-        <w:rPr>
-          <w:rStyle w:val="math-inline"/>
-          <w:rFonts w:asciiTheme="majorBidi" w:hAnsiTheme="majorBidi" w:cstheme="majorBidi"/>
-          <w:sz w:val="22"/>
-          <w:szCs w:val="22"/>
-        </w:rPr>
-        <w:t>$45,000 / 70 = \$642.857142857$</w:t>
-      </w:r>
-    </w:p>
-    <w:p>
-      <w:pPr>
-        <w:pStyle w:val="NormalWeb"/>
-        <w:numPr>
-          <w:ilvl w:val="1"/>
-          <w:numId w:val="10"/>
-        </w:numPr>
-        <w:spacing w:before="0" w:beforeAutospacing="0"/>
-        <w:rPr>
-          <w:rFonts w:asciiTheme="majorBidi" w:hAnsiTheme="majorBidi" w:cstheme="majorBidi"/>
-          <w:sz w:val="22"/>
-          <w:szCs w:val="22"/>
-        </w:rPr>
-      </w:pPr>
-      <w:r>
-        <w:rPr>
-          <w:rFonts w:asciiTheme="majorBidi" w:hAnsiTheme="majorBidi" w:cstheme="majorBidi"/>
-          <w:b/>
-          <w:bCs/>
-          <w:sz w:val="22"/>
-          <w:szCs w:val="22"/>
-        </w:rPr>
-        <w:t>Ethan (1005)</w:t>
-      </w:r>
-      <w:r>
-        <w:rPr>
-          <w:rFonts w:asciiTheme="majorBidi" w:hAnsiTheme="majorBidi" w:cstheme="majorBidi"/>
-          <w:sz w:val="22"/>
-          <w:szCs w:val="22"/>
-        </w:rPr>
-        <w:t>:</w:t>
-      </w:r>
-    </w:p>
-    <w:p>
-      <w:pPr>
-        <w:pStyle w:val="NormalWeb"/>
-        <w:numPr>
-          <w:ilvl w:val="2"/>
-          <w:numId w:val="10"/>
-        </w:numPr>
-        <w:spacing w:before="0" w:beforeAutospacing="0"/>
-        <w:rPr>
-          <w:rFonts w:asciiTheme="majorBidi" w:hAnsiTheme="majorBidi" w:cstheme="majorBidi"/>
-          <w:sz w:val="22"/>
-          <w:szCs w:val="22"/>
-        </w:rPr>
-      </w:pPr>
-      <w:r>
-        <w:rPr>
-          <w:rFonts w:asciiTheme="majorBidi" w:hAnsiTheme="majorBidi" w:cstheme="majorBidi"/>
-          <w:sz w:val="22"/>
-          <w:szCs w:val="22"/>
-        </w:rPr>
-        <w:t xml:space="preserve">No policies: </w:t>
-      </w:r>
-      <w:r>
-        <w:rPr>
-          <w:rStyle w:val="math-inline"/>
-          <w:rFonts w:asciiTheme="majorBidi" w:hAnsiTheme="majorBidi" w:cstheme="majorBidi"/>
-          <w:sz w:val="22"/>
-          <w:szCs w:val="22"/>
-        </w:rPr>
-        <w:t>$\$0.00$</w:t>
-      </w:r>
-    </w:p>
-    <w:p>
-      <w:pPr>
-        <w:pStyle w:val="NormalWeb"/>
-        <w:numPr>
-          <w:ilvl w:val="1"/>
-          <w:numId w:val="10"/>
-        </w:numPr>
-        <w:spacing w:before="0" w:beforeAutospacing="0"/>
-        <w:rPr>
-          <w:rFonts w:asciiTheme="majorBidi" w:hAnsiTheme="majorBidi" w:cstheme="majorBidi"/>
-          <w:sz w:val="22"/>
-          <w:szCs w:val="22"/>
-        </w:rPr>
-      </w:pPr>
-      <w:r>
-        <w:rPr>
-          <w:rFonts w:asciiTheme="majorBidi" w:hAnsiTheme="majorBidi" w:cstheme="majorBidi"/>
-          <w:sz w:val="22"/>
-          <w:szCs w:val="22"/>
-        </w:rPr>
-        <w:t xml:space="preserve">Total for Shiraz: </w:t>
-      </w:r>
-      <w:r>
-        <w:rPr>
-          <w:rStyle w:val="math-inline"/>
-          <w:rFonts w:asciiTheme="majorBidi" w:hAnsiTheme="majorBidi" w:cstheme="majorBidi"/>
-          <w:sz w:val="22"/>
-          <w:szCs w:val="22"/>
-        </w:rPr>
-        <w:t>$34.615384615 + 642.857142857 = 677.472527473$</w:t>
-      </w:r>
-    </w:p>
-    <w:p>
-      <w:pPr>
-        <w:pStyle w:val="NormalWeb"/>
-        <w:numPr>
-          <w:ilvl w:val="1"/>
-          <w:numId w:val="10"/>
-        </w:numPr>
-        <w:spacing w:before="0" w:beforeAutospacing="0"/>
-        <w:rPr>
-          <w:rFonts w:asciiTheme="majorBidi" w:hAnsiTheme="majorBidi" w:cstheme="majorBidi"/>
-          <w:sz w:val="22"/>
-          <w:szCs w:val="22"/>
-        </w:rPr>
-      </w:pPr>
-      <w:r>
-        <w:rPr>
-          <w:rFonts w:asciiTheme="majorBidi" w:hAnsiTheme="majorBidi" w:cstheme="majorBidi"/>
-          <w:b/>
-          <w:bCs/>
-          <w:sz w:val="22"/>
-          <w:szCs w:val="22"/>
-        </w:rPr>
-        <w:t>Expected result:</w:t>
-      </w:r>
-      <w:r>
-        <w:rPr>
-          <w:rFonts w:asciiTheme="majorBidi" w:hAnsiTheme="majorBidi" w:cstheme="majorBidi"/>
-          <w:sz w:val="22"/>
-          <w:szCs w:val="22"/>
-        </w:rPr>
-        <w:t xml:space="preserve"> </w:t>
-      </w:r>
-      <w:r>
-        <w:rPr>
-          <w:rStyle w:val="math-inline"/>
-          <w:rFonts w:asciiTheme="majorBidi" w:hAnsiTheme="majorBidi" w:cstheme="majorBidi"/>
-          <w:sz w:val="22"/>
-          <w:szCs w:val="22"/>
-        </w:rPr>
-        <w:t>$\$677.473$</w:t>
-      </w:r>
-      <w:r>
-        <w:rPr>
-          <w:rStyle w:val="math-inline"/>
-          <w:rFonts w:asciiTheme="majorBidi" w:hAnsiTheme="majorBidi" w:cstheme="majorBidi"/>
-          <w:sz w:val="22"/>
-          <w:szCs w:val="22"/>
-        </w:rPr>
-        <w:br/>
-      </w:r>
-    </w:p>
-    <w:p>
-      <w:pPr>
-        <w:pStyle w:val="NormalWeb"/>
-        <w:numPr>
-          <w:ilvl w:val="0"/>
-          <w:numId w:val="10"/>
-        </w:numPr>
-        <w:spacing w:before="0" w:beforeAutospacing="0"/>
-        <w:rPr>
-          <w:rFonts w:asciiTheme="majorBidi" w:hAnsiTheme="majorBidi" w:cstheme="majorBidi"/>
-          <w:sz w:val="22"/>
-          <w:szCs w:val="22"/>
-        </w:rPr>
-      </w:pPr>
-      <w:proofErr w:type="spellStart"/>
-      <w:r>
-        <w:rPr>
-          <w:rFonts w:asciiTheme="majorBidi" w:hAnsiTheme="majorBidi" w:cstheme="majorBidi"/>
-          <w:b/>
-          <w:bCs/>
-          <w:sz w:val="22"/>
-          <w:szCs w:val="22"/>
-        </w:rPr>
-        <w:t>getTotalPaymentForCity</w:t>
-      </w:r>
-      <w:proofErr w:type="spellEnd"/>
-      <w:r>
-        <w:rPr>
-          <w:rFonts w:asciiTheme="majorBidi" w:hAnsiTheme="majorBidi" w:cstheme="majorBidi"/>
-          <w:b/>
-          <w:bCs/>
-          <w:sz w:val="22"/>
-          <w:szCs w:val="22"/>
-        </w:rPr>
-        <w:t>("Melbourne")</w:t>
-      </w:r>
-    </w:p>
-    <w:p>
-      <w:pPr>
-        <w:pStyle w:val="NormalWeb"/>
-        <w:numPr>
-          <w:ilvl w:val="1"/>
-          <w:numId w:val="10"/>
-        </w:numPr>
-        <w:spacing w:before="0" w:beforeAutospacing="0"/>
-        <w:rPr>
-          <w:rFonts w:asciiTheme="majorBidi" w:hAnsiTheme="majorBidi" w:cstheme="majorBidi"/>
-          <w:sz w:val="22"/>
-          <w:szCs w:val="22"/>
-        </w:rPr>
-      </w:pPr>
-      <w:r>
-        <w:rPr>
-          <w:rFonts w:asciiTheme="majorBidi" w:hAnsiTheme="majorBidi" w:cstheme="majorBidi"/>
-          <w:sz w:val="22"/>
-          <w:szCs w:val="22"/>
-        </w:rPr>
-        <w:t xml:space="preserve">No users registered under </w:t>
-      </w:r>
-      <w:proofErr w:type="gramStart"/>
-      <w:r>
-        <w:rPr>
-          <w:rFonts w:asciiTheme="majorBidi" w:hAnsiTheme="majorBidi" w:cstheme="majorBidi"/>
-          <w:sz w:val="22"/>
-          <w:szCs w:val="22"/>
-        </w:rPr>
-        <w:t xml:space="preserve">Melbourne </w:t>
-      </w:r>
-      <w:r>
-        <w:rPr>
-          <w:rStyle w:val="math-inline"/>
-          <w:rFonts w:asciiTheme="majorBidi" w:hAnsiTheme="majorBidi" w:cstheme="majorBidi"/>
-          <w:sz w:val="22"/>
-          <w:szCs w:val="22"/>
-        </w:rPr>
-        <w:t>:</w:t>
-      </w:r>
-      <w:proofErr w:type="gramEnd"/>
-      <w:r>
-        <w:rPr>
-          <w:rStyle w:val="math-inline"/>
-          <w:rFonts w:asciiTheme="majorBidi" w:hAnsiTheme="majorBidi" w:cstheme="majorBidi"/>
-          <w:sz w:val="22"/>
-          <w:szCs w:val="22"/>
-        </w:rPr>
-        <w:t xml:space="preserve"> </w:t>
-      </w:r>
-      <w:r>
-        <w:rPr>
-          <w:rFonts w:asciiTheme="majorBidi" w:hAnsiTheme="majorBidi" w:cstheme="majorBidi"/>
-          <w:sz w:val="22"/>
-          <w:szCs w:val="22"/>
-        </w:rPr>
-        <w:t xml:space="preserve">returns </w:t>
-      </w:r>
-      <w:r>
-        <w:rPr>
-          <w:rStyle w:val="math-inline"/>
-          <w:rFonts w:asciiTheme="majorBidi" w:hAnsiTheme="majorBidi" w:cstheme="majorBidi"/>
-          <w:sz w:val="22"/>
-          <w:szCs w:val="22"/>
-        </w:rPr>
-        <w:t>$0.0$</w:t>
-      </w:r>
-      <w:r>
-        <w:rPr>
-          <w:rFonts w:asciiTheme="majorBidi" w:hAnsiTheme="majorBidi" w:cstheme="majorBidi"/>
-          <w:sz w:val="22"/>
-          <w:szCs w:val="22"/>
-        </w:rPr>
-        <w:t>.</w:t>
-      </w:r>
-    </w:p>
-    <w:p>
-      <w:pPr>
-        <w:pStyle w:val="NormalWeb"/>
-        <w:numPr>
-          <w:ilvl w:val="1"/>
-          <w:numId w:val="10"/>
-        </w:numPr>
-        <w:spacing w:before="0" w:beforeAutospacing="0"/>
-        <w:rPr>
-          <w:rFonts w:asciiTheme="majorBidi" w:hAnsiTheme="majorBidi" w:cstheme="majorBidi"/>
-          <w:sz w:val="22"/>
-          <w:szCs w:val="22"/>
-        </w:rPr>
-      </w:pPr>
-      <w:r>
-        <w:rPr>
-          <w:rFonts w:asciiTheme="majorBidi" w:hAnsiTheme="majorBidi" w:cstheme="majorBidi"/>
-          <w:b/>
-          <w:bCs/>
-          <w:sz w:val="22"/>
-          <w:szCs w:val="22"/>
-        </w:rPr>
-        <w:t>Expected result:</w:t>
-      </w:r>
-      <w:r>
-        <w:rPr>
-          <w:rFonts w:asciiTheme="majorBidi" w:hAnsiTheme="majorBidi" w:cstheme="majorBidi"/>
-          <w:sz w:val="22"/>
-          <w:szCs w:val="22"/>
-        </w:rPr>
-        <w:t xml:space="preserve"> </w:t>
-      </w:r>
-      <w:r>
-        <w:rPr>
-          <w:rStyle w:val="math-inline"/>
-          <w:rFonts w:asciiTheme="majorBidi" w:hAnsiTheme="majorBidi" w:cstheme="majorBidi"/>
-          <w:sz w:val="22"/>
-          <w:szCs w:val="22"/>
-        </w:rPr>
-        <w:t>$\$0.000$</w:t>
+        <w:t>0.00</w:t>
       </w:r>
       <w:r>
         <w:rPr>
@@ -6743,7 +6096,7 @@
       <w:tblGrid>
         <w:gridCol w:w="656"/>
         <w:gridCol w:w="4163"/>
-        <w:gridCol w:w="2896"/>
+        <w:gridCol w:w="2309"/>
         <w:gridCol w:w="1797"/>
       </w:tblGrid>
       <w:tr>
@@ -7109,16 +6462,7 @@
                 <w:szCs w:val="24"/>
                 <w:bdr w:val="none" w:sz="0" w:space="0" w:color="auto" w:frame="1"/>
               </w:rPr>
-              <w:t>1096.830357</w:t>
-            </w:r>
-            <w:r>
-              <w:rPr>
-                <w:rFonts w:asciiTheme="majorBidi" w:eastAsia="Times New Roman" w:hAnsiTheme="majorBidi" w:cstheme="majorBidi"/>
-                <w:color w:val="1F1F1F"/>
-                <w:sz w:val="24"/>
-                <w:szCs w:val="24"/>
-              </w:rPr>
-              <w:t xml:space="preserve"> </w:t>
+              <w:t>2279.00</w:t>
             </w:r>
           </w:p>
           <w:p>
@@ -7265,16 +6609,7 @@
                 <w:szCs w:val="24"/>
                 <w:bdr w:val="none" w:sz="0" w:space="0" w:color="auto" w:frame="1"/>
               </w:rPr>
-              <w:t>677.472527</w:t>
-            </w:r>
-            <w:r>
-              <w:rPr>
-                <w:rFonts w:asciiTheme="majorBidi" w:eastAsia="Times New Roman" w:hAnsiTheme="majorBidi" w:cstheme="majorBidi"/>
-                <w:color w:val="1F1F1F"/>
-                <w:sz w:val="24"/>
-                <w:szCs w:val="24"/>
-              </w:rPr>
-              <w:t xml:space="preserve"> </w:t>
+              <w:t>1520.00</w:t>
             </w:r>
           </w:p>
           <w:p>
@@ -7567,7 +6902,57 @@
                 <w:szCs w:val="24"/>
                 <w:bdr w:val="none" w:sz="0" w:space="0" w:color="auto" w:frame="1"/>
               </w:rPr>
-              <w:t>[1096.830357, 677.472527]</w:t>
+              <w:t>[</w:t>
+            </w:r>
+            <w:r>
+              <w:rPr>
+                <w:rFonts w:asciiTheme="majorBidi" w:eastAsia="Times New Roman" w:hAnsiTheme="majorBidi" w:cstheme="majorBidi"/>
+                <w:color w:val="1F1F1F"/>
+                <w:sz w:val="24"/>
+                <w:szCs w:val="24"/>
+                <w:bdr w:val="none" w:sz="0" w:space="0" w:color="auto" w:frame="1"/>
+              </w:rPr>
+              <w:t>2</w:t>
+            </w:r>
+            <w:r>
+              <w:rPr>
+                <w:rFonts w:eastAsia="Times New Roman"/>
+                <w:color w:val="1F1F1F"/>
+                <w:sz w:val="24"/>
+                <w:szCs w:val="24"/>
+                <w:bdr w:val="none" w:sz="0" w:space="0" w:color="auto" w:frame="1"/>
+              </w:rPr>
+              <w:t>279.00</w:t>
+            </w:r>
+            <w:r>
+              <w:rPr>
+                <w:rFonts w:asciiTheme="majorBidi" w:eastAsia="Times New Roman" w:hAnsiTheme="majorBidi" w:cstheme="majorBidi"/>
+                <w:color w:val="1F1F1F"/>
+                <w:sz w:val="24"/>
+                <w:szCs w:val="24"/>
+                <w:bdr w:val="none" w:sz="0" w:space="0" w:color="auto" w:frame="1"/>
+              </w:rPr>
+              <w:t>,</w:t>
+            </w:r>
+            <w:r>
+              <w:rPr>
+                <w:rFonts w:eastAsia="Times New Roman"/>
+                <w:color w:val="1F1F1F"/>
+                <w:sz w:val="24"/>
+                <w:szCs w:val="24"/>
+                <w:bdr w:val="none" w:sz="0" w:space="0" w:color="auto" w:frame="1"/>
+              </w:rPr>
+              <w:t xml:space="preserve"> 1520.0</w:t>
+            </w:r>
+            <w:r>
+              <w:rPr>
+                <w:rFonts w:asciiTheme="majorBidi" w:eastAsia="Times New Roman" w:hAnsiTheme="majorBidi" w:cstheme="majorBidi"/>
+                <w:color w:val="1F1F1F"/>
+                <w:sz w:val="24"/>
+                <w:szCs w:val="24"/>
+                <w:bdr w:val="none" w:sz="0" w:space="0" w:color="auto" w:frame="1"/>
+              </w:rPr>
+              <w:t>]</w:t>
             </w:r>
             <w:r>
               <w:rPr>
@@ -7783,6 +7168,7 @@
           <w:color w:val="1F1F1F"/>
           <w:bdr w:val="none" w:sz="0" w:space="0" w:color="auto" w:frame="1"/>
         </w:rPr>
+        <w:lastRenderedPageBreak/>
         <w:t>removePolicy</w:t>
       </w:r>
       <w:proofErr w:type="spellEnd"/>
@@ -7982,309 +7368,6 @@
     </w:p>
     <w:p>
       <w:pPr>
-        <w:rPr>
-          <w:rFonts w:ascii="Arial" w:hAnsi="Arial" w:cs="Arial"/>
-          <w:color w:val="1F1F1F"/>
-        </w:rPr>
-      </w:pPr>
-      <w:r>
-        <w:rPr>
-          <w:rFonts w:ascii="Arial" w:hAnsi="Arial" w:cs="Arial"/>
-          <w:b/>
-          <w:bCs/>
-          <w:color w:val="1F1F1F"/>
-          <w:bdr w:val="none" w:sz="0" w:space="0" w:color="auto" w:frame="1"/>
-        </w:rPr>
-        <w:t>Feature 2: Auto-Generated User ID</w:t>
-      </w:r>
-    </w:p>
-    <w:p>
-      <w:pPr>
-        <w:rPr>
-          <w:rFonts w:ascii="Arial" w:hAnsi="Arial" w:cs="Arial"/>
-          <w:color w:val="1F1F1F"/>
-        </w:rPr>
-      </w:pPr>
-      <w:r>
-        <w:rPr>
-          <w:rFonts w:ascii="Arial" w:hAnsi="Arial" w:cs="Arial"/>
-          <w:color w:val="1F1F1F"/>
-        </w:rPr>
-        <w:lastRenderedPageBreak/>
-        <w:br/>
-      </w:r>
-    </w:p>
-    <w:p>
-      <w:pPr>
-        <w:numPr>
-          <w:ilvl w:val="0"/>
-          <w:numId w:val="12"/>
-        </w:numPr>
-        <w:spacing w:after="0" w:line="240" w:lineRule="auto"/>
-        <w:rPr>
-          <w:rFonts w:ascii="Arial" w:hAnsi="Arial" w:cs="Arial"/>
-          <w:color w:val="1F1F1F"/>
-        </w:rPr>
-      </w:pPr>
-      <w:r>
-        <w:rPr>
-          <w:rFonts w:ascii="Arial" w:hAnsi="Arial" w:cs="Arial"/>
-          <w:b/>
-          <w:bCs/>
-          <w:color w:val="1F1F1F"/>
-          <w:bdr w:val="none" w:sz="0" w:space="0" w:color="auto" w:frame="1"/>
-        </w:rPr>
-        <w:t>Incremental Generation:</w:t>
-      </w:r>
-      <w:r>
-        <w:rPr>
-          <w:rFonts w:ascii="Arial" w:hAnsi="Arial" w:cs="Arial"/>
-          <w:color w:val="1F1F1F"/>
-        </w:rPr>
-        <w:t xml:space="preserve"> When creating users with the auto-generated ID constructor, the class increments a </w:t>
-      </w:r>
-      <w:r>
-        <w:rPr>
-          <w:rStyle w:val="HTMLCode"/>
-          <w:rFonts w:ascii="Arial" w:eastAsiaTheme="minorEastAsia" w:hAnsi="Arial" w:cs="Arial"/>
-          <w:color w:val="1F1F1F"/>
-          <w:sz w:val="23"/>
-          <w:szCs w:val="23"/>
-        </w:rPr>
-        <w:t>static int</w:t>
-      </w:r>
-      <w:r>
-        <w:rPr>
-          <w:rFonts w:ascii="Arial" w:hAnsi="Arial" w:cs="Arial"/>
-          <w:color w:val="1F1F1F"/>
-        </w:rPr>
-        <w:t xml:space="preserve"> counter sequentially. User </w:t>
-      </w:r>
-      <w:r>
-        <w:rPr>
-          <w:rStyle w:val="math-inline"/>
-          <w:rFonts w:ascii="Arial" w:hAnsi="Arial" w:cs="Arial"/>
-          <w:color w:val="1F1F1F"/>
-          <w:bdr w:val="none" w:sz="0" w:space="0" w:color="auto" w:frame="1"/>
-        </w:rPr>
-        <w:t>$A$</w:t>
-      </w:r>
-      <w:r>
-        <w:rPr>
-          <w:rFonts w:ascii="Arial" w:hAnsi="Arial" w:cs="Arial"/>
-          <w:color w:val="1F1F1F"/>
-        </w:rPr>
-        <w:t xml:space="preserve"> receives ID </w:t>
-      </w:r>
-      <w:r>
-        <w:rPr>
-          <w:rStyle w:val="math-inline"/>
-          <w:rFonts w:ascii="Arial" w:hAnsi="Arial" w:cs="Arial"/>
-          <w:color w:val="1F1F1F"/>
-          <w:bdr w:val="none" w:sz="0" w:space="0" w:color="auto" w:frame="1"/>
-        </w:rPr>
-        <w:t>$N$</w:t>
-      </w:r>
-      <w:r>
-        <w:rPr>
-          <w:rFonts w:ascii="Arial" w:hAnsi="Arial" w:cs="Arial"/>
-          <w:color w:val="1F1F1F"/>
-        </w:rPr>
-        <w:t xml:space="preserve">, and User </w:t>
-      </w:r>
-      <w:r>
-        <w:rPr>
-          <w:rStyle w:val="math-inline"/>
-          <w:rFonts w:ascii="Arial" w:hAnsi="Arial" w:cs="Arial"/>
-          <w:color w:val="1F1F1F"/>
-          <w:bdr w:val="none" w:sz="0" w:space="0" w:color="auto" w:frame="1"/>
-        </w:rPr>
-        <w:t>$B$</w:t>
-      </w:r>
-      <w:r>
-        <w:rPr>
-          <w:rFonts w:ascii="Arial" w:hAnsi="Arial" w:cs="Arial"/>
-          <w:color w:val="1F1F1F"/>
-        </w:rPr>
-        <w:t xml:space="preserve"> receives </w:t>
-      </w:r>
-      <w:r>
-        <w:rPr>
-          <w:rStyle w:val="math-inline"/>
-          <w:rFonts w:ascii="Arial" w:hAnsi="Arial" w:cs="Arial"/>
-          <w:color w:val="1F1F1F"/>
-          <w:bdr w:val="none" w:sz="0" w:space="0" w:color="auto" w:frame="1"/>
-        </w:rPr>
-        <w:t>$N + 1$</w:t>
-      </w:r>
-      <w:r>
-        <w:rPr>
-          <w:rFonts w:ascii="Arial" w:hAnsi="Arial" w:cs="Arial"/>
-          <w:color w:val="1F1F1F"/>
-        </w:rPr>
-        <w:t xml:space="preserve">, verifying that </w:t>
-      </w:r>
-      <w:r>
-        <w:rPr>
-          <w:rStyle w:val="math-inline"/>
-          <w:rFonts w:ascii="Arial" w:hAnsi="Arial" w:cs="Arial"/>
-          <w:color w:val="1F1F1F"/>
-          <w:bdr w:val="none" w:sz="0" w:space="0" w:color="auto" w:frame="1"/>
-        </w:rPr>
-        <w:t>$ID_B - ID_A = 1$</w:t>
-      </w:r>
-      <w:r>
-        <w:rPr>
-          <w:rFonts w:ascii="Arial" w:hAnsi="Arial" w:cs="Arial"/>
-          <w:color w:val="1F1F1F"/>
-        </w:rPr>
-        <w:t>.</w:t>
-      </w:r>
-    </w:p>
-    <w:p>
-      <w:pPr>
-        <w:ind w:left="720"/>
-        <w:rPr>
-          <w:rFonts w:ascii="Arial" w:hAnsi="Arial" w:cs="Arial"/>
-          <w:color w:val="1F1F1F"/>
-        </w:rPr>
-      </w:pPr>
-    </w:p>
-    <w:p>
-      <w:pPr>
-        <w:numPr>
-          <w:ilvl w:val="0"/>
-          <w:numId w:val="12"/>
-        </w:numPr>
-        <w:spacing w:after="0" w:line="240" w:lineRule="auto"/>
-        <w:rPr>
-          <w:rFonts w:ascii="Arial" w:hAnsi="Arial" w:cs="Arial"/>
-          <w:color w:val="1F1F1F"/>
-        </w:rPr>
-      </w:pPr>
-      <w:r>
-        <w:rPr>
-          <w:rFonts w:ascii="Arial" w:hAnsi="Arial" w:cs="Arial"/>
-          <w:b/>
-          <w:bCs/>
-          <w:color w:val="1F1F1F"/>
-          <w:bdr w:val="none" w:sz="0" w:space="0" w:color="auto" w:frame="1"/>
-        </w:rPr>
-        <w:t>Unique ID Generation:</w:t>
-      </w:r>
-      <w:r>
-        <w:rPr>
-          <w:rFonts w:ascii="Arial" w:hAnsi="Arial" w:cs="Arial"/>
-          <w:color w:val="1F1F1F"/>
-        </w:rPr>
-        <w:t xml:space="preserve"> A user instantiated via auto-generation is guaranteed a unique ID, allowing </w:t>
-      </w:r>
-      <w:proofErr w:type="spellStart"/>
-      <w:proofErr w:type="gramStart"/>
-      <w:r>
-        <w:rPr>
-          <w:rStyle w:val="HTMLCode"/>
-          <w:rFonts w:ascii="Arial" w:eastAsiaTheme="minorEastAsia" w:hAnsi="Arial" w:cs="Arial"/>
-          <w:color w:val="1F1F1F"/>
-          <w:sz w:val="23"/>
-          <w:szCs w:val="23"/>
-        </w:rPr>
-        <w:t>company.addUser</w:t>
-      </w:r>
-      <w:proofErr w:type="spellEnd"/>
-      <w:proofErr w:type="gramEnd"/>
-      <w:r>
-        <w:rPr>
-          <w:rStyle w:val="HTMLCode"/>
-          <w:rFonts w:ascii="Arial" w:eastAsiaTheme="minorEastAsia" w:hAnsi="Arial" w:cs="Arial"/>
-          <w:color w:val="1F1F1F"/>
-          <w:sz w:val="23"/>
-          <w:szCs w:val="23"/>
-        </w:rPr>
-        <w:t>(</w:t>
-      </w:r>
-      <w:proofErr w:type="spellStart"/>
-      <w:r>
-        <w:rPr>
-          <w:rStyle w:val="HTMLCode"/>
-          <w:rFonts w:ascii="Arial" w:eastAsiaTheme="minorEastAsia" w:hAnsi="Arial" w:cs="Arial"/>
-          <w:color w:val="1F1F1F"/>
-          <w:sz w:val="23"/>
-          <w:szCs w:val="23"/>
-        </w:rPr>
-        <w:t>newUser</w:t>
-      </w:r>
-      <w:proofErr w:type="spellEnd"/>
-      <w:r>
-        <w:rPr>
-          <w:rStyle w:val="HTMLCode"/>
-          <w:rFonts w:ascii="Arial" w:eastAsiaTheme="minorEastAsia" w:hAnsi="Arial" w:cs="Arial"/>
-          <w:color w:val="1F1F1F"/>
-          <w:sz w:val="23"/>
-          <w:szCs w:val="23"/>
-        </w:rPr>
-        <w:t>)</w:t>
-      </w:r>
-      <w:r>
-        <w:rPr>
-          <w:rFonts w:ascii="Arial" w:hAnsi="Arial" w:cs="Arial"/>
-          <w:color w:val="1F1F1F"/>
-        </w:rPr>
-        <w:t xml:space="preserve"> to successfully return </w:t>
-      </w:r>
-      <w:r>
-        <w:rPr>
-          <w:rStyle w:val="HTMLCode"/>
-          <w:rFonts w:ascii="Arial" w:eastAsiaTheme="minorEastAsia" w:hAnsi="Arial" w:cs="Arial"/>
-          <w:color w:val="1F1F1F"/>
-          <w:sz w:val="23"/>
-          <w:szCs w:val="23"/>
-        </w:rPr>
-        <w:t>true</w:t>
-      </w:r>
-      <w:r>
-        <w:rPr>
-          <w:rFonts w:ascii="Arial" w:hAnsi="Arial" w:cs="Arial"/>
-          <w:color w:val="1F1F1F"/>
-        </w:rPr>
-        <w:t>.</w:t>
-      </w:r>
-    </w:p>
-    <w:p>
-      <w:pPr>
-        <w:rPr>
-          <w:rFonts w:ascii="Arial" w:hAnsi="Arial" w:cs="Arial"/>
-          <w:color w:val="1F1F1F"/>
-        </w:rPr>
-      </w:pPr>
-      <w:r>
-        <w:rPr>
-          <w:rFonts w:ascii="Arial" w:hAnsi="Arial" w:cs="Arial"/>
-          <w:b/>
-          <w:bCs/>
-          <w:color w:val="1F1F1F"/>
-          <w:bdr w:val="none" w:sz="0" w:space="0" w:color="auto" w:frame="1"/>
-        </w:rPr>
-        <w:t>User Removal</w:t>
-      </w:r>
-    </w:p>
-    <w:p>
-      <w:pPr>
-        <w:rPr>
-          <w:rFonts w:ascii="Arial" w:hAnsi="Arial" w:cs="Arial"/>
-          <w:color w:val="1F1F1F"/>
-        </w:rPr>
-      </w:pPr>
-      <w:r>
-        <w:rPr>
-          <w:rFonts w:ascii="Arial" w:hAnsi="Arial" w:cs="Arial"/>
-          <w:color w:val="1F1F1F"/>
-        </w:rPr>
-        <w:br/>
-      </w:r>
-    </w:p>
-    <w:p>
-      <w:pPr>
         <w:numPr>
           <w:ilvl w:val="0"/>
           <w:numId w:val="13"/>
@@ -8569,39 +7652,6 @@
     </w:p>
     <w:p>
       <w:pPr>
-        <w:rPr>
-          <w:rFonts w:ascii="Arial" w:hAnsi="Arial" w:cs="Arial"/>
-          <w:color w:val="1F1F1F"/>
-        </w:rPr>
-      </w:pPr>
-      <w:r>
-        <w:rPr>
-          <w:rFonts w:ascii="Arial" w:hAnsi="Arial" w:cs="Arial"/>
-          <w:b/>
-          <w:bCs/>
-          <w:color w:val="1F1F1F"/>
-          <w:bdr w:val="none" w:sz="0" w:space="0" w:color="auto" w:frame="1"/>
-        </w:rPr>
-        <w:t>Feature 4: Change Admin Password</w:t>
-      </w:r>
-    </w:p>
-    <w:p>
-      <w:pPr>
-        <w:rPr>
-          <w:rFonts w:ascii="Arial" w:hAnsi="Arial" w:cs="Arial"/>
-          <w:color w:val="1F1F1F"/>
-        </w:rPr>
-      </w:pPr>
-      <w:r>
-        <w:rPr>
-          <w:rFonts w:ascii="Arial" w:hAnsi="Arial" w:cs="Arial"/>
-          <w:color w:val="1F1F1F"/>
-        </w:rPr>
-        <w:br/>
-      </w:r>
-    </w:p>
-    <w:p>
-      <w:pPr>
         <w:numPr>
           <w:ilvl w:val="0"/>
           <w:numId w:val="14"/>
@@ -9028,13 +8078,6 @@
           <w:color w:val="1F1F1F"/>
         </w:rPr>
       </w:pPr>
-      <w:r>
-        <w:rPr>
-          <w:rFonts w:ascii="Arial" w:hAnsi="Arial" w:cs="Arial"/>
-          <w:color w:val="1F1F1F"/>
-        </w:rPr>
-        <w:br/>
-      </w:r>
     </w:p>
     <w:p>
       <w:pPr>
@@ -9072,7 +8115,6 @@
           <w:rFonts w:ascii="Arial" w:hAnsi="Arial" w:cs="Arial"/>
           <w:color w:val="1F1F1F"/>
         </w:rPr>
-        <w:lastRenderedPageBreak/>
         <w:br/>
       </w:r>
     </w:p>
@@ -9266,24 +8308,7 @@
     </w:p>
     <w:p>
       <w:pPr>
-        <w:ind w:left="1440"/>
-        <w:rPr>
-          <w:rFonts w:ascii="Arial" w:hAnsi="Arial" w:cs="Arial"/>
-          <w:color w:val="1F1F1F"/>
-        </w:rPr>
-      </w:pPr>
-    </w:p>
-    <w:p>
-      <w:pPr>
-        <w:numPr>
-          <w:ilvl w:val="1"/>
-          <w:numId w:val="15"/>
-        </w:numPr>
-        <w:spacing w:after="0" w:line="240" w:lineRule="auto"/>
-        <w:rPr>
-          <w:rFonts w:ascii="Arial" w:hAnsi="Arial" w:cs="Arial"/>
-          <w:color w:val="1F1F1F"/>
-        </w:rPr>
+        <w:pStyle w:val="NormalWeb"/>
       </w:pPr>
       <w:proofErr w:type="spellStart"/>
       <w:proofErr w:type="gramStart"/>
@@ -9328,18 +8353,7 @@
           <w:color w:val="1F1F1F"/>
           <w:bdr w:val="none" w:sz="0" w:space="0" w:color="auto" w:frame="1"/>
         </w:rPr>
-        <w:t xml:space="preserve">: Reflects post-rise price ($27,500 / 320) = </w:t>
-      </w:r>
-      <w:r>
-        <w:rPr>
-          <w:rStyle w:val="HTMLCode"/>
-          <w:rFonts w:ascii="Arial" w:eastAsiaTheme="minorEastAsia" w:hAnsi="Arial" w:cs="Arial"/>
-          <w:color w:val="1F1F1F"/>
-          <w:sz w:val="23"/>
-          <w:szCs w:val="23"/>
-          <w:bdr w:val="none" w:sz="0" w:space="0" w:color="auto" w:frame="1"/>
-        </w:rPr>
-        <w:t>$85.9375</w:t>
+        <w:t xml:space="preserve">: Reflects post-rise price </w:t>
       </w:r>
       <w:r>
         <w:rPr>
@@ -9347,7 +8361,10 @@
           <w:color w:val="1F1F1F"/>
           <w:bdr w:val="none" w:sz="0" w:space="0" w:color="auto" w:frame="1"/>
         </w:rPr>
-        <w:t>.</w:t>
+        <w:t xml:space="preserve">= </w:t>
+      </w:r>
+      <w:r>
+        <w:t>27500/100 + 1*200 + 20 = 275 + 200 + 20 = 495.0</w:t>
       </w:r>
       <w:r>
         <w:rPr>
@@ -9814,16 +8831,7 @@
                 <w:color w:val="1F1F1F"/>
                 <w:bdr w:val="none" w:sz="0" w:space="0" w:color="auto" w:frame="1"/>
               </w:rPr>
-              <w:t xml:space="preserve">Test </w:t>
-            </w:r>
-            <w:r>
-              <w:rPr>
-                <w:rStyle w:val="Strong"/>
-                <w:rFonts w:ascii="Arial" w:hAnsi="Arial" w:cs="Arial"/>
-                <w:color w:val="1F1F1F"/>
-                <w:bdr w:val="none" w:sz="0" w:space="0" w:color="auto" w:frame="1"/>
-              </w:rPr>
-              <w:t>methods</w:t>
+              <w:t>Test methods</w:t>
             </w:r>
           </w:p>
         </w:tc>
@@ -10651,7 +9659,6 @@
                 <w:color w:val="1F1F1F"/>
                 <w:bdr w:val="none" w:sz="0" w:space="0" w:color="auto" w:frame="1"/>
               </w:rPr>
-              <w:lastRenderedPageBreak/>
               <w:t>34</w:t>
             </w:r>
           </w:p>
@@ -11462,13 +10469,12 @@
             <w:r>
               <w:rPr>
                 <w:rStyle w:val="HTMLCode"/>
-                <w:rFonts w:ascii="Arial" w:eastAsiaTheme="minorEastAsia" w:hAnsi="Arial" w:cs="Arial"/>
-                <w:color w:val="1F1F1F"/>
+                <w:rFonts w:eastAsiaTheme="minorEastAsia"/>
                 <w:sz w:val="23"/>
                 <w:szCs w:val="23"/>
                 <w:bdr w:val="none" w:sz="0" w:space="0" w:color="auto" w:frame="1"/>
               </w:rPr>
-              <w:t>85.9375</w:t>
+              <w:t>495.00</w:t>
             </w:r>
           </w:p>
         </w:tc>
@@ -11516,6 +10522,7 @@
                 <w:color w:val="1F1F1F"/>
                 <w:bdr w:val="none" w:sz="0" w:space="0" w:color="auto" w:frame="1"/>
               </w:rPr>
+              <w:lastRenderedPageBreak/>
               <w:t>42</w:t>
             </w:r>
           </w:p>
@@ -24518,7 +23525,6 @@
     <w:name w:val="Normal (Web)"/>
     <w:basedOn w:val="Normal"/>
     <w:uiPriority w:val="99"/>
-    <w:semiHidden/>
     <w:unhideWhenUsed/>
     <w:rsid w:val="004A1483"/>
     <w:pPr>

</xml_diff>